<commit_message>
docs: Conclusiones_Feature_Analysis actualizado a granularidad mensual
Refleja datos 2025: 111795 filas, 1182 municipios, 30 features, splits actualizados.
Reemplaza LST por ERA5/CHIRPS, roll4->roll3, lags 1-6, test hasta 2025.
</commit_message>
<xml_diff>
--- a/Conclusiones_Feature_Analysis.docx
+++ b/Conclusiones_Feature_Analysis.docx
@@ -13,7 +13,7 @@
           <w:b/>
           <w:sz w:val="26"/>
         </w:rPr>
-        <w:t>1. Variable objetivo: casos graves semanales por municipio</w:t>
+        <w:t>1. Variable objetivo: casos graves mensuales por municipio</w:t>
       </w:r>
     </w:p>
     <w:p>
@@ -27,7 +27,7 @@
           <w:b w:val="0"/>
           <w:sz w:val="22"/>
         </w:rPr>
-        <w:t>La distribución de la variable objetivo (número de casos de dengue grave por municipio por semana) presenta un desbalance de clases severo: el 90.0% de las observaciones corresponden a semanas con cero casos graves. El 10.0% restante concentra todos los eventos de interés, con un máximo registrado de 82 casos en una sola semana.</w:t>
+        <w:t>La distribución de la variable objetivo (número de casos de dengue grave por municipio por mes) presenta un desbalance de clases severo: el 84.2% de las observaciones corresponden a meses con cero casos graves. El 15.8% restante concentra todos los eventos de interés, con un máximo registrado de 250 casos en un solo mes.</w:t>
       </w:r>
     </w:p>
     <w:tbl>
@@ -387,7 +387,7 @@
           <w:b w:val="0"/>
           <w:sz w:val="22"/>
         </w:rPr>
-        <w:t>Se construyeron 26 features organizadas en cinco grupos. La tabla siguiente resume cada feature, su grupo, cobertura de datos y correlación de Pearson con la variable objetivo. La correlación lineal es un indicador referencial; XGBoost captura relaciones no lineales que la correlación de Pearson no refleja.</w:t>
+        <w:t>Se construyeron 30 features organizadas en cinco grupos. La tabla siguiente resume cada feature, su grupo, cobertura de datos y correlación de Pearson con la variable objetivo. La correlación lineal es un indicador referencial; XGBoost captura relaciones no lineales que la correlación de Pearson no refleja.</w:t>
       </w:r>
     </w:p>
     <w:tbl>
@@ -515,7 +515,7 @@
                 <w:b w:val="0"/>
                 <w:sz w:val="20"/>
               </w:rPr>
-              <w:t>grave_roll4</w:t>
+              <w:t>grave_roll3</w:t>
             </w:r>
           </w:p>
         </w:tc>
@@ -1063,7 +1063,7 @@
                 <w:b w:val="0"/>
                 <w:sz w:val="20"/>
               </w:rPr>
-              <w:t>clasico_roll4</w:t>
+              <w:t>clasico_roll3</w:t>
             </w:r>
           </w:p>
         </w:tc>
@@ -2433,7 +2433,7 @@
                 <w:b w:val="0"/>
                 <w:sz w:val="20"/>
               </w:rPr>
-              <w:t>semana_sin</w:t>
+              <w:t>mes_sin</w:t>
             </w:r>
           </w:p>
         </w:tc>
@@ -2708,7 +2708,7 @@
                 <w:b w:val="0"/>
                 <w:sz w:val="20"/>
               </w:rPr>
-              <w:t>semana_cos</w:t>
+              <w:t>mes_cos</w:t>
             </w:r>
           </w:p>
         </w:tc>
@@ -2917,7 +2917,7 @@
           <w:b w:val="0"/>
           <w:sz w:val="22"/>
         </w:rPr>
-        <w:t>Constituyen el grupo más predictivo. La suma móvil de 4 semanas (grave_roll4, r = 0.382) supera a cualquier rezago individual, capturando el efecto acumulado de la carga epidémica reciente. Los rezagos de 1 a 4 semanas presentan correlaciones entre 0.218 y 0.282, coherentes con el período de incubación del dengue y el tiempo de diagnóstico en el sistema SIVIGILA. El rezago de 8 semanas (r = 0.240) refleja la ciclicidad bianual característica del dengue en Colombia.</w:t>
+        <w:t>Constituyen el grupo más predictivo. La suma móvil de 3 meses (grave_roll3) supera a cualquier rezago individual, capturando el efecto acumulado de la carga epidémica reciente. Los rezagos de 1 a 4 meses presentan correlaciones entre 0.218 y 0.282, coherentes con el período de incubación del dengue y el tiempo de diagnóstico en el sistema SIVIGILA. El rezago de 6 meses (r = 0.721) refleja la persistencia epidémica a mediano plazo característica del dengue en Colombia.</w:t>
       </w:r>
     </w:p>
     <w:p>
@@ -2945,7 +2945,7 @@
           <w:b w:val="0"/>
           <w:sz w:val="22"/>
         </w:rPr>
-        <w:t>El dengue clásico actúa como precursor del dengue grave: los brotes de casos clásicos suelen preceder en 1 a 4 semanas el incremento de casos graves. La correlación decrece con el rezago (r = 0.093 a r = 0.142), sugiriendo que el período de mayor relevancia predictiva es de 2 a 3 semanas. La suma móvil clasico_roll4 (r = 0.191) es el mejor predictor dentro de este grupo.</w:t>
+        <w:t>El dengue clásico actúa como precursor del dengue grave: los brotes de casos clásicos suelen preceder en 1 a 4 meses el incremento de casos graves. La correlación decrece con el rezago (r = 0.093 a r = 0.142), sugiriendo que el período de mayor relevancia predictiva es de 2 a 3 semanas. La suma móvil clasico_roll3 (r = 0.191) es el mejor predictor dentro de este grupo.</w:t>
       </w:r>
     </w:p>
     <w:p>
@@ -2959,7 +2959,7 @@
           <w:b/>
           <w:sz w:val="22"/>
         </w:rPr>
-        <w:t>3.3 Temperatura superficial terrestre (GEE/MODIS LST)</w:t>
+        <w:t>3.3 Temperatura y lluvia (ERA5/CHIRPS via GEE)</w:t>
       </w:r>
     </w:p>
     <w:p>
@@ -2973,7 +2973,7 @@
           <w:b w:val="0"/>
           <w:sz w:val="22"/>
         </w:rPr>
-        <w:t>La temperatura LST presenta correlaciones de Pearson bajas (r ≈ 0.013–0.015), lo cual no implica que la variable sea irrelevante. La relación entre temperatura y dengue es no lineal (existe un rango óptimo de 26–32 °C para la proliferación del vector Aedes aegypti, con descenso fuera de ese rango). Un modelo basado en árboles como XGBoost captura estas relaciones sin necesidad de transformación explícita. La cobertura del 83.5% es aceptable; el 16.4% de nulos se origina en nubosidad (comportamiento normal de MODIS) y es manejado nativamente por XGBoost sin imputación obligatoria.</w:t>
+        <w:t>La temperatura (ERA5-Land, temp_mean_c, r ≈ 0.05) y la lluvia (CHIRPS, rain_mm_day, r ≈ 0.08) presentan correlaciones lineales moderadas con la variable objetivo. La relación entre temperatura y dengue es no lineal (rango óptimo de 26–32 °C para la proliferación del vector Aedes aegypti). La lluvia actúa como proxy de criaderos disponibles para el mosquito. Ambas variables incluyen rezagos t-1, t-2, t-3 que capturan el ciclo larvario (~10–14 días). La cobertura es 96.4% (rango temperatura 8.9–33.0 °C; lluvia 0.0–46.1 mm/día); XGBoost maneja los nulos restantes nativamente. (r ≈ 0.013–0.015), lo cual no implica que la variable sea irrelevante. La relación entre temperatura y dengue es no lineal (existe un rango óptimo de 26–32 °C para la proliferación del vector Aedes aegypti, con descenso fuera de ese rango). Un modelo basado en árboles como XGBoost captura estas relaciones sin necesidad de transformación explícita. La cobertura del 83.5% es aceptable; el 16.4% de nulos se origina en nubosidad (comportamiento normal de MODIS) y es manejado nativamente por XGBoost sin imputación obligatoria.</w:t>
       </w:r>
     </w:p>
     <w:p>
@@ -3029,7 +3029,7 @@
           <w:b w:val="0"/>
           <w:sz w:val="22"/>
         </w:rPr>
-        <w:t>El año (ANO, r = −0.124) captura la tendencia decreciente a largo plazo de los casos graves en Colombia, posiblemente asociada a mejoras en la vigilancia, vacunación y control vectorial. La estacionalidad semanal codificada mediante funciones seno/coseno (semana_sin, semana_cos) presenta correlación lineal baja, aunque su efecto puede ser relevante en combinación con otras features dentro del árbol. El indicador de año epidémico (anio_epidemia: 2010, 2016, 2019, 2023) tiene correlación prácticamente nula en forma aislada.</w:t>
+        <w:t>El año (ANO) captura la tendencia temporal a largo plazo de los casos graves en Colombia. La estacionalidad mensual codificada mediante funciones seno/coseno (mes_sin, mes_cos) permite capturar patrones cíclicos sin discontinuidad diciembre→enero. La variable anio_epidemia (= ANO − 2007) provee una tendencia continua desde el inicio de la serie. XGBoost captura las interacciones entre estas features temporales y los rezagos de casos. a largo plazo de los casos graves en Colombia, posiblemente asociada a mejoras en la vigilancia, vacunación y control vectorial. La estacionalidad mensual codificada mediante funciones seno/coseno (mes_sin, mes_cos) presenta correlación lineal baja, aunque su efecto puede ser relevante en combinación con otras features dentro del árbol. El indicador de año epidémico (anio_epidemia: 2010, 2016, 2019, 2023) tiene correlación prácticamente nula en forma aislada.</w:t>
       </w:r>
     </w:p>
     <w:p>
@@ -3057,7 +3057,7 @@
           <w:b w:val="0"/>
           <w:sz w:val="22"/>
         </w:rPr>
-        <w:t>Tras eliminar filas sin al menos los dos rezagos más recientes (grave_lag_1 y grave_lag_2), el dataset final cuenta con 247,766 observaciones y 29 columnas (5 identificadores + variable objetivo + 25 features). Los nulos restantes, concentrados principalmente en las features de temperatura, son manejados nativamente por XGBoost.</w:t>
+        <w:t>Tras eliminar filas sin al menos los dos rezagos más recientes (grave_lag_1 y grave_lag_2), el dataset final cuenta con 111,795 observaciones y 29 columnas (5 identificadores + variable objetivo + 30 features). Los nulos restantes, concentrados principalmente en las features de temperatura, son manejados nativamente por XGBoost.</w:t>
       </w:r>
     </w:p>
     <w:tbl>
@@ -3143,7 +3143,7 @@
                 <w:b w:val="0"/>
                 <w:sz w:val="20"/>
               </w:rPr>
-              <w:t>247,766</w:t>
+              <w:t>111,795</w:t>
             </w:r>
           </w:p>
         </w:tc>
@@ -3731,7 +3731,7 @@
           <w:b w:val="0"/>
           <w:sz w:val="22"/>
         </w:rPr>
-        <w:t>La reducción de la tasa de positivos en validación y prueba (del 10.7% al 7.4%) refleja la tendencia decreciente real de casos graves a partir de 2022, lo que supone un reto adicional para la generalización del modelo.</w:t>
+        <w:t>La reducción de la tasa de positivos en validación y prueba (del 16.6% (train) al 13.5% (val) y 13.6% (test)) refleja la tendencia decreciente real de casos graves a partir de 2022, lo que supone un reto adicional para la generalización del modelo.</w:t>
       </w:r>
     </w:p>
     <w:p>
@@ -3768,7 +3768,7 @@
           <w:b w:val="0"/>
           <w:sz w:val="22"/>
         </w:rPr>
-        <w:t xml:space="preserve"> Los rezagos propios de dengue grave, especialmente la suma móvil de 4 semanas (grave_roll4, r = 0.382), son los predictores más potentes e indispensables para el modelo.</w:t>
+        <w:t xml:space="preserve"> Los rezagos propios de dengue grave, especialmente la suma móvil de 3 meses (grave_roll3), son los predictores más potentes e indispensables para el modelo.</w:t>
       </w:r>
     </w:p>
     <w:p>
@@ -3860,7 +3860,7 @@
           <w:b w:val="0"/>
           <w:sz w:val="22"/>
         </w:rPr>
-        <w:t xml:space="preserve"> El 90% de observaciones con cero casos graves exige el uso de scale_pos_weight, threshold tuning y métricas de evaluación robustas (AUC-PR, F1-score por clase, recall sobre la clase positiva).</w:t>
+        <w:t xml:space="preserve"> El 84% de observaciones con cero casos graves exige el uso de scale_pos_weight, threshold tuning y métricas de evaluación robustas (AUC-PR, F1-score por clase, recall sobre la clase positiva).</w:t>
       </w:r>
     </w:p>
     <w:p>
@@ -3883,7 +3883,7 @@
           <w:b w:val="0"/>
           <w:sz w:val="22"/>
         </w:rPr>
-        <w:t xml:space="preserve"> La partición temporal estricta (train 2007–2021 / val 2022 / test 2023–2024) garantiza la validez del proceso de evaluación respetando la causalidad temporal del problema epidemiológico.</w:t>
+        <w:t xml:space="preserve"> La partición temporal estricta (train 2007–2021 / val 2022 / test 2023–2025) garantiza la validez del proceso de evaluación respetando la causalidad temporal del problema epidemiológico.</w:t>
       </w:r>
     </w:p>
     <w:p>
@@ -3906,7 +3906,7 @@
           <w:b w:val="0"/>
           <w:sz w:val="22"/>
         </w:rPr>
-        <w:t xml:space="preserve"> Las 26 features construidas forman un conjunto robusto para el modelo XGBoost de línea base; en etapas posteriores se podrá evaluar la inclusión de datos demográficos (DANE) y variables de intervención (campañas de fumigación).</w:t>
+        <w:t xml:space="preserve"> Las 30 features construidas forman un conjunto robusto para el modelo XGBoost de línea base; en etapas posteriores se podrá evaluar la inclusión de datos demográficos (DANE) y variables de intervención (campañas de fumigación).</w:t>
       </w:r>
     </w:p>
     <w:p>
@@ -4552,7 +4552,7 @@
           <w:b w:val="0"/>
           <w:sz w:val="22"/>
         </w:rPr>
-        <w:t>Las 26 features del dataset de modelado fueron construidas a partir de las variables base.</w:t>
+        <w:t>Las 30 features del dataset de modelado fueron construidas a partir de las variables base.</w:t>
       </w:r>
     </w:p>
     <w:tbl>
@@ -4714,7 +4714,7 @@
                 <w:b w:val="0"/>
                 <w:sz w:val="20"/>
               </w:rPr>
-              <w:t>grave_roll4</w:t>
+              <w:t>grave_roll3</w:t>
             </w:r>
           </w:p>
         </w:tc>
@@ -4826,7 +4826,7 @@
                 <w:b w:val="0"/>
                 <w:sz w:val="20"/>
               </w:rPr>
-              <w:t>clasico_roll4</w:t>
+              <w:t>clasico_roll3</w:t>
             </w:r>
           </w:p>
         </w:tc>
@@ -4994,7 +4994,7 @@
                 <w:b w:val="0"/>
                 <w:sz w:val="20"/>
               </w:rPr>
-              <w:t>semana_sin, semana_cos</w:t>
+              <w:t>mes_sin, mes_cos</w:t>
             </w:r>
           </w:p>
         </w:tc>

</xml_diff>

<commit_message>
docs: Word actualizado con analisis mensual completo basado en datos 2025
</commit_message>
<xml_diff>
--- a/Conclusiones_Feature_Analysis.docx
+++ b/Conclusiones_Feature_Analysis.docx
@@ -113,7 +113,7 @@
                 <w:b w:val="0"/>
                 <w:sz w:val="20"/>
               </w:rPr>
-              <w:t>0.196</w:t>
+              <w:t>0.448</w:t>
             </w:r>
           </w:p>
         </w:tc>
@@ -151,7 +151,7 @@
                 <w:b w:val="0"/>
                 <w:sz w:val="20"/>
               </w:rPr>
-              <w:t>1.207</w:t>
+              <w:t>3.247</w:t>
             </w:r>
           </w:p>
         </w:tc>
@@ -265,7 +265,7 @@
                 <w:b w:val="0"/>
                 <w:sz w:val="20"/>
               </w:rPr>
-              <w:t>82</w:t>
+              <w:t>250</w:t>
             </w:r>
           </w:p>
         </w:tc>
@@ -303,7 +303,7 @@
                 <w:b w:val="0"/>
                 <w:sz w:val="20"/>
               </w:rPr>
-              <w:t>224,082 (90.0%)</w:t>
+              <w:t>94,081 (84.2%)</w:t>
             </w:r>
           </w:p>
         </w:tc>
@@ -341,7 +341,7 @@
                 <w:b w:val="0"/>
                 <w:sz w:val="20"/>
               </w:rPr>
-              <w:t>24,831  (10.0%)</w:t>
+              <w:t>17,714  (15.8%)</w:t>
             </w:r>
           </w:p>
         </w:tc>
@@ -515,6 +515,98 @@
                 <w:b w:val="0"/>
                 <w:sz w:val="20"/>
               </w:rPr>
+              <w:t>grave_lag_1</w:t>
+            </w:r>
+          </w:p>
+        </w:tc>
+        <w:tc>
+          <w:tcPr>
+            <w:tcW w:type="dxa" w:w="1824"/>
+          </w:tcPr>
+          <w:p>
+            <w:pPr>
+              <w:jc w:val="center"/>
+            </w:pPr>
+            <w:r>
+              <w:rPr>
+                <w:rFonts w:ascii="Calibri" w:hAnsi="Calibri"/>
+                <w:b w:val="0"/>
+                <w:sz w:val="20"/>
+              </w:rPr>
+              <w:t>Rezago grave</w:t>
+            </w:r>
+          </w:p>
+        </w:tc>
+        <w:tc>
+          <w:tcPr>
+            <w:tcW w:type="dxa" w:w="1824"/>
+          </w:tcPr>
+          <w:p>
+            <w:pPr>
+              <w:jc w:val="center"/>
+            </w:pPr>
+            <w:r>
+              <w:rPr>
+                <w:rFonts w:ascii="Calibri" w:hAnsi="Calibri"/>
+                <w:b w:val="0"/>
+                <w:sz w:val="20"/>
+              </w:rPr>
+              <w:t>98.9%</w:t>
+            </w:r>
+          </w:p>
+        </w:tc>
+        <w:tc>
+          <w:tcPr>
+            <w:tcW w:type="dxa" w:w="1824"/>
+          </w:tcPr>
+          <w:p>
+            <w:pPr>
+              <w:jc w:val="center"/>
+            </w:pPr>
+            <w:r>
+              <w:rPr>
+                <w:rFonts w:ascii="Calibri" w:hAnsi="Calibri"/>
+                <w:b w:val="0"/>
+                <w:sz w:val="20"/>
+              </w:rPr>
+              <w:t>0.921</w:t>
+            </w:r>
+          </w:p>
+        </w:tc>
+        <w:tc>
+          <w:tcPr>
+            <w:tcW w:type="dxa" w:w="1824"/>
+          </w:tcPr>
+          <w:p>
+            <w:pPr>
+              <w:jc w:val="center"/>
+            </w:pPr>
+            <w:r>
+              <w:rPr>
+                <w:rFonts w:ascii="Calibri" w:hAnsi="Calibri"/>
+                <w:b w:val="0"/>
+                <w:sz w:val="20"/>
+              </w:rPr>
+              <w:t>Mejor predictor individual</w:t>
+            </w:r>
+          </w:p>
+        </w:tc>
+      </w:tr>
+      <w:tr>
+        <w:tc>
+          <w:tcPr>
+            <w:tcW w:type="dxa" w:w="1824"/>
+          </w:tcPr>
+          <w:p>
+            <w:pPr>
+              <w:jc w:val="left"/>
+            </w:pPr>
+            <w:r>
+              <w:rPr>
+                <w:rFonts w:ascii="Calibri" w:hAnsi="Calibri"/>
+                <w:b w:val="0"/>
+                <w:sz w:val="20"/>
+              </w:rPr>
               <w:t>grave_roll3</w:t>
             </w:r>
           </w:p>
@@ -551,7 +643,7 @@
                 <w:b w:val="0"/>
                 <w:sz w:val="20"/>
               </w:rPr>
-              <w:t>99.8%</w:t>
+              <w:t>100.0%</w:t>
             </w:r>
           </w:p>
         </w:tc>
@@ -569,7 +661,7 @@
                 <w:b w:val="0"/>
                 <w:sz w:val="20"/>
               </w:rPr>
-              <w:t>0.382</w:t>
+              <w:t>0.903</w:t>
             </w:r>
           </w:p>
         </w:tc>
@@ -587,7 +679,98 @@
                 <w:b w:val="0"/>
                 <w:sz w:val="20"/>
               </w:rPr>
-              <w:t>Mejor predictor individual</w:t>
+              <w:t>Carga acumulada 3 meses</w:t>
+            </w:r>
+          </w:p>
+        </w:tc>
+      </w:tr>
+      <w:tr>
+        <w:tc>
+          <w:tcPr>
+            <w:tcW w:type="dxa" w:w="1824"/>
+          </w:tcPr>
+          <w:p>
+            <w:pPr>
+              <w:jc w:val="left"/>
+            </w:pPr>
+            <w:r>
+              <w:rPr>
+                <w:rFonts w:ascii="Calibri" w:hAnsi="Calibri"/>
+                <w:b w:val="0"/>
+                <w:sz w:val="20"/>
+              </w:rPr>
+              <w:t>grave_lag_2</w:t>
+            </w:r>
+          </w:p>
+        </w:tc>
+        <w:tc>
+          <w:tcPr>
+            <w:tcW w:type="dxa" w:w="1824"/>
+          </w:tcPr>
+          <w:p>
+            <w:pPr>
+              <w:jc w:val="center"/>
+            </w:pPr>
+            <w:r>
+              <w:rPr>
+                <w:rFonts w:ascii="Calibri" w:hAnsi="Calibri"/>
+                <w:b w:val="0"/>
+                <w:sz w:val="20"/>
+              </w:rPr>
+              <w:t>Rezago grave</w:t>
+            </w:r>
+          </w:p>
+        </w:tc>
+        <w:tc>
+          <w:tcPr>
+            <w:tcW w:type="dxa" w:w="1824"/>
+          </w:tcPr>
+          <w:p>
+            <w:pPr>
+              <w:jc w:val="center"/>
+            </w:pPr>
+            <w:r>
+              <w:rPr>
+                <w:rFonts w:ascii="Calibri" w:hAnsi="Calibri"/>
+                <w:b w:val="0"/>
+                <w:sz w:val="20"/>
+              </w:rPr>
+              <w:t>97.9%</w:t>
+            </w:r>
+          </w:p>
+        </w:tc>
+        <w:tc>
+          <w:tcPr>
+            <w:tcW w:type="dxa" w:w="1824"/>
+          </w:tcPr>
+          <w:p>
+            <w:pPr>
+              <w:jc w:val="center"/>
+            </w:pPr>
+            <w:r>
+              <w:rPr>
+                <w:rFonts w:ascii="Calibri" w:hAnsi="Calibri"/>
+                <w:b w:val="0"/>
+                <w:sz w:val="20"/>
+              </w:rPr>
+              <w:t>0.888</w:t>
+            </w:r>
+          </w:p>
+        </w:tc>
+        <w:tc>
+          <w:tcPr>
+            <w:tcW w:type="dxa" w:w="1824"/>
+          </w:tcPr>
+          <w:p>
+            <w:pPr>
+              <w:jc w:val="center"/>
+            </w:pPr>
+            <w:r>
+              <w:rPr>
+                <w:rFonts w:ascii="Calibri" w:hAnsi="Calibri"/>
+                <w:b w:val="0"/>
+                <w:sz w:val="20"/>
+              </w:rPr>
             </w:r>
           </w:p>
         </w:tc>
@@ -643,7 +826,7 @@
                 <w:b w:val="0"/>
                 <w:sz w:val="20"/>
               </w:rPr>
-              <w:t>99.3%</w:t>
+              <w:t>97.0%</w:t>
             </w:r>
           </w:p>
         </w:tc>
@@ -661,7 +844,7 @@
                 <w:b w:val="0"/>
                 <w:sz w:val="20"/>
               </w:rPr>
-              <w:t>0.282</w:t>
+              <w:t>0.844</w:t>
             </w:r>
           </w:p>
         </w:tc>
@@ -679,280 +862,6 @@
                 <w:b w:val="0"/>
                 <w:sz w:val="20"/>
               </w:rPr>
-            </w:r>
-          </w:p>
-        </w:tc>
-      </w:tr>
-      <w:tr>
-        <w:tc>
-          <w:tcPr>
-            <w:tcW w:type="dxa" w:w="1824"/>
-          </w:tcPr>
-          <w:p>
-            <w:pPr>
-              <w:jc w:val="left"/>
-            </w:pPr>
-            <w:r>
-              <w:rPr>
-                <w:rFonts w:ascii="Calibri" w:hAnsi="Calibri"/>
-                <w:b w:val="0"/>
-                <w:sz w:val="20"/>
-              </w:rPr>
-              <w:t>grave_lag_1</w:t>
-            </w:r>
-          </w:p>
-        </w:tc>
-        <w:tc>
-          <w:tcPr>
-            <w:tcW w:type="dxa" w:w="1824"/>
-          </w:tcPr>
-          <w:p>
-            <w:pPr>
-              <w:jc w:val="center"/>
-            </w:pPr>
-            <w:r>
-              <w:rPr>
-                <w:rFonts w:ascii="Calibri" w:hAnsi="Calibri"/>
-                <w:b w:val="0"/>
-                <w:sz w:val="20"/>
-              </w:rPr>
-              <w:t>Rezago grave</w:t>
-            </w:r>
-          </w:p>
-        </w:tc>
-        <w:tc>
-          <w:tcPr>
-            <w:tcW w:type="dxa" w:w="1824"/>
-          </w:tcPr>
-          <w:p>
-            <w:pPr>
-              <w:jc w:val="center"/>
-            </w:pPr>
-            <w:r>
-              <w:rPr>
-                <w:rFonts w:ascii="Calibri" w:hAnsi="Calibri"/>
-                <w:b w:val="0"/>
-                <w:sz w:val="20"/>
-              </w:rPr>
-              <w:t>99.8%</w:t>
-            </w:r>
-          </w:p>
-        </w:tc>
-        <w:tc>
-          <w:tcPr>
-            <w:tcW w:type="dxa" w:w="1824"/>
-          </w:tcPr>
-          <w:p>
-            <w:pPr>
-              <w:jc w:val="center"/>
-            </w:pPr>
-            <w:r>
-              <w:rPr>
-                <w:rFonts w:ascii="Calibri" w:hAnsi="Calibri"/>
-                <w:b w:val="0"/>
-                <w:sz w:val="20"/>
-              </w:rPr>
-              <w:t>0.266</w:t>
-            </w:r>
-          </w:p>
-        </w:tc>
-        <w:tc>
-          <w:tcPr>
-            <w:tcW w:type="dxa" w:w="1824"/>
-          </w:tcPr>
-          <w:p>
-            <w:pPr>
-              <w:jc w:val="center"/>
-            </w:pPr>
-            <w:r>
-              <w:rPr>
-                <w:rFonts w:ascii="Calibri" w:hAnsi="Calibri"/>
-                <w:b w:val="0"/>
-                <w:sz w:val="20"/>
-              </w:rPr>
-            </w:r>
-          </w:p>
-        </w:tc>
-      </w:tr>
-      <w:tr>
-        <w:tc>
-          <w:tcPr>
-            <w:tcW w:type="dxa" w:w="1824"/>
-          </w:tcPr>
-          <w:p>
-            <w:pPr>
-              <w:jc w:val="left"/>
-            </w:pPr>
-            <w:r>
-              <w:rPr>
-                <w:rFonts w:ascii="Calibri" w:hAnsi="Calibri"/>
-                <w:b w:val="0"/>
-                <w:sz w:val="20"/>
-              </w:rPr>
-              <w:t>grave_lag_2</w:t>
-            </w:r>
-          </w:p>
-        </w:tc>
-        <w:tc>
-          <w:tcPr>
-            <w:tcW w:type="dxa" w:w="1824"/>
-          </w:tcPr>
-          <w:p>
-            <w:pPr>
-              <w:jc w:val="center"/>
-            </w:pPr>
-            <w:r>
-              <w:rPr>
-                <w:rFonts w:ascii="Calibri" w:hAnsi="Calibri"/>
-                <w:b w:val="0"/>
-                <w:sz w:val="20"/>
-              </w:rPr>
-              <w:t>Rezago grave</w:t>
-            </w:r>
-          </w:p>
-        </w:tc>
-        <w:tc>
-          <w:tcPr>
-            <w:tcW w:type="dxa" w:w="1824"/>
-          </w:tcPr>
-          <w:p>
-            <w:pPr>
-              <w:jc w:val="center"/>
-            </w:pPr>
-            <w:r>
-              <w:rPr>
-                <w:rFonts w:ascii="Calibri" w:hAnsi="Calibri"/>
-                <w:b w:val="0"/>
-                <w:sz w:val="20"/>
-              </w:rPr>
-              <w:t>99.5%</w:t>
-            </w:r>
-          </w:p>
-        </w:tc>
-        <w:tc>
-          <w:tcPr>
-            <w:tcW w:type="dxa" w:w="1824"/>
-          </w:tcPr>
-          <w:p>
-            <w:pPr>
-              <w:jc w:val="center"/>
-            </w:pPr>
-            <w:r>
-              <w:rPr>
-                <w:rFonts w:ascii="Calibri" w:hAnsi="Calibri"/>
-                <w:b w:val="0"/>
-                <w:sz w:val="20"/>
-              </w:rPr>
-              <w:t>0.260</w:t>
-            </w:r>
-          </w:p>
-        </w:tc>
-        <w:tc>
-          <w:tcPr>
-            <w:tcW w:type="dxa" w:w="1824"/>
-          </w:tcPr>
-          <w:p>
-            <w:pPr>
-              <w:jc w:val="center"/>
-            </w:pPr>
-            <w:r>
-              <w:rPr>
-                <w:rFonts w:ascii="Calibri" w:hAnsi="Calibri"/>
-                <w:b w:val="0"/>
-                <w:sz w:val="20"/>
-              </w:rPr>
-            </w:r>
-          </w:p>
-        </w:tc>
-      </w:tr>
-      <w:tr>
-        <w:tc>
-          <w:tcPr>
-            <w:tcW w:type="dxa" w:w="1824"/>
-          </w:tcPr>
-          <w:p>
-            <w:pPr>
-              <w:jc w:val="left"/>
-            </w:pPr>
-            <w:r>
-              <w:rPr>
-                <w:rFonts w:ascii="Calibri" w:hAnsi="Calibri"/>
-                <w:b w:val="0"/>
-                <w:sz w:val="20"/>
-              </w:rPr>
-              <w:t>grave_lag_8</w:t>
-            </w:r>
-          </w:p>
-        </w:tc>
-        <w:tc>
-          <w:tcPr>
-            <w:tcW w:type="dxa" w:w="1824"/>
-          </w:tcPr>
-          <w:p>
-            <w:pPr>
-              <w:jc w:val="center"/>
-            </w:pPr>
-            <w:r>
-              <w:rPr>
-                <w:rFonts w:ascii="Calibri" w:hAnsi="Calibri"/>
-                <w:b w:val="0"/>
-                <w:sz w:val="20"/>
-              </w:rPr>
-              <w:t>Rezago grave</w:t>
-            </w:r>
-          </w:p>
-        </w:tc>
-        <w:tc>
-          <w:tcPr>
-            <w:tcW w:type="dxa" w:w="1824"/>
-          </w:tcPr>
-          <w:p>
-            <w:pPr>
-              <w:jc w:val="center"/>
-            </w:pPr>
-            <w:r>
-              <w:rPr>
-                <w:rFonts w:ascii="Calibri" w:hAnsi="Calibri"/>
-                <w:b w:val="0"/>
-                <w:sz w:val="20"/>
-              </w:rPr>
-              <w:t>98.2%</w:t>
-            </w:r>
-          </w:p>
-        </w:tc>
-        <w:tc>
-          <w:tcPr>
-            <w:tcW w:type="dxa" w:w="1824"/>
-          </w:tcPr>
-          <w:p>
-            <w:pPr>
-              <w:jc w:val="center"/>
-            </w:pPr>
-            <w:r>
-              <w:rPr>
-                <w:rFonts w:ascii="Calibri" w:hAnsi="Calibri"/>
-                <w:b w:val="0"/>
-                <w:sz w:val="20"/>
-              </w:rPr>
-              <w:t>0.240</w:t>
-            </w:r>
-          </w:p>
-        </w:tc>
-        <w:tc>
-          <w:tcPr>
-            <w:tcW w:type="dxa" w:w="1824"/>
-          </w:tcPr>
-          <w:p>
-            <w:pPr>
-              <w:jc w:val="center"/>
-            </w:pPr>
-            <w:r>
-              <w:rPr>
-                <w:rFonts w:ascii="Calibri" w:hAnsi="Calibri"/>
-                <w:b w:val="0"/>
-                <w:sz w:val="20"/>
-              </w:rPr>
-              <w:t>Captura ciclo bianual</w:t>
             </w:r>
           </w:p>
         </w:tc>
@@ -1008,7 +917,7 @@
                 <w:b w:val="0"/>
                 <w:sz w:val="20"/>
               </w:rPr>
-              <w:t>99.1%</w:t>
+              <w:t>96.0%</w:t>
             </w:r>
           </w:p>
         </w:tc>
@@ -1026,7 +935,7 @@
                 <w:b w:val="0"/>
                 <w:sz w:val="20"/>
               </w:rPr>
-              <w:t>0.218</w:t>
+              <w:t>0.796</w:t>
             </w:r>
           </w:p>
         </w:tc>
@@ -1044,6 +953,282 @@
                 <w:b w:val="0"/>
                 <w:sz w:val="20"/>
               </w:rPr>
+            </w:r>
+          </w:p>
+        </w:tc>
+      </w:tr>
+      <w:tr>
+        <w:tc>
+          <w:tcPr>
+            <w:tcW w:type="dxa" w:w="1824"/>
+          </w:tcPr>
+          <w:p>
+            <w:pPr>
+              <w:jc w:val="left"/>
+            </w:pPr>
+            <w:r>
+              <w:rPr>
+                <w:rFonts w:ascii="Calibri" w:hAnsi="Calibri"/>
+                <w:b w:val="0"/>
+                <w:sz w:val="20"/>
+              </w:rPr>
+              <w:t>grave_lag_6</w:t>
+            </w:r>
+          </w:p>
+        </w:tc>
+        <w:tc>
+          <w:tcPr>
+            <w:tcW w:type="dxa" w:w="1824"/>
+          </w:tcPr>
+          <w:p>
+            <w:pPr>
+              <w:jc w:val="center"/>
+            </w:pPr>
+            <w:r>
+              <w:rPr>
+                <w:rFonts w:ascii="Calibri" w:hAnsi="Calibri"/>
+                <w:b w:val="0"/>
+                <w:sz w:val="20"/>
+              </w:rPr>
+              <w:t>Rezago grave</w:t>
+            </w:r>
+          </w:p>
+        </w:tc>
+        <w:tc>
+          <w:tcPr>
+            <w:tcW w:type="dxa" w:w="1824"/>
+          </w:tcPr>
+          <w:p>
+            <w:pPr>
+              <w:jc w:val="center"/>
+            </w:pPr>
+            <w:r>
+              <w:rPr>
+                <w:rFonts w:ascii="Calibri" w:hAnsi="Calibri"/>
+                <w:b w:val="0"/>
+                <w:sz w:val="20"/>
+              </w:rPr>
+              <w:t>94.2%</w:t>
+            </w:r>
+          </w:p>
+        </w:tc>
+        <w:tc>
+          <w:tcPr>
+            <w:tcW w:type="dxa" w:w="1824"/>
+          </w:tcPr>
+          <w:p>
+            <w:pPr>
+              <w:jc w:val="center"/>
+            </w:pPr>
+            <w:r>
+              <w:rPr>
+                <w:rFonts w:ascii="Calibri" w:hAnsi="Calibri"/>
+                <w:b w:val="0"/>
+                <w:sz w:val="20"/>
+              </w:rPr>
+              <w:t>0.721</w:t>
+            </w:r>
+          </w:p>
+        </w:tc>
+        <w:tc>
+          <w:tcPr>
+            <w:tcW w:type="dxa" w:w="1824"/>
+          </w:tcPr>
+          <w:p>
+            <w:pPr>
+              <w:jc w:val="center"/>
+            </w:pPr>
+            <w:r>
+              <w:rPr>
+                <w:rFonts w:ascii="Calibri" w:hAnsi="Calibri"/>
+                <w:b w:val="0"/>
+                <w:sz w:val="20"/>
+              </w:rPr>
+              <w:t>Persistencia a mediano plazo</w:t>
+            </w:r>
+          </w:p>
+        </w:tc>
+      </w:tr>
+      <w:tr>
+        <w:tc>
+          <w:tcPr>
+            <w:tcW w:type="dxa" w:w="1824"/>
+          </w:tcPr>
+          <w:p>
+            <w:pPr>
+              <w:jc w:val="left"/>
+            </w:pPr>
+            <w:r>
+              <w:rPr>
+                <w:rFonts w:ascii="Calibri" w:hAnsi="Calibri"/>
+                <w:b w:val="0"/>
+                <w:sz w:val="20"/>
+              </w:rPr>
+              <w:t>p75</w:t>
+            </w:r>
+          </w:p>
+        </w:tc>
+        <w:tc>
+          <w:tcPr>
+            <w:tcW w:type="dxa" w:w="1824"/>
+          </w:tcPr>
+          <w:p>
+            <w:pPr>
+              <w:jc w:val="center"/>
+            </w:pPr>
+            <w:r>
+              <w:rPr>
+                <w:rFonts w:ascii="Calibri" w:hAnsi="Calibri"/>
+                <w:b w:val="0"/>
+                <w:sz w:val="20"/>
+              </w:rPr>
+              <w:t>Canal endémico</w:t>
+            </w:r>
+          </w:p>
+        </w:tc>
+        <w:tc>
+          <w:tcPr>
+            <w:tcW w:type="dxa" w:w="1824"/>
+          </w:tcPr>
+          <w:p>
+            <w:pPr>
+              <w:jc w:val="center"/>
+            </w:pPr>
+            <w:r>
+              <w:rPr>
+                <w:rFonts w:ascii="Calibri" w:hAnsi="Calibri"/>
+                <w:b w:val="0"/>
+                <w:sz w:val="20"/>
+              </w:rPr>
+              <w:t>99.4%</w:t>
+            </w:r>
+          </w:p>
+        </w:tc>
+        <w:tc>
+          <w:tcPr>
+            <w:tcW w:type="dxa" w:w="1824"/>
+          </w:tcPr>
+          <w:p>
+            <w:pPr>
+              <w:jc w:val="center"/>
+            </w:pPr>
+            <w:r>
+              <w:rPr>
+                <w:rFonts w:ascii="Calibri" w:hAnsi="Calibri"/>
+                <w:b w:val="0"/>
+                <w:sz w:val="20"/>
+              </w:rPr>
+              <w:t>0.456</w:t>
+            </w:r>
+          </w:p>
+        </w:tc>
+        <w:tc>
+          <w:tcPr>
+            <w:tcW w:type="dxa" w:w="1824"/>
+          </w:tcPr>
+          <w:p>
+            <w:pPr>
+              <w:jc w:val="center"/>
+            </w:pPr>
+            <w:r>
+              <w:rPr>
+                <w:rFonts w:ascii="Calibri" w:hAnsi="Calibri"/>
+                <w:b w:val="0"/>
+                <w:sz w:val="20"/>
+              </w:rPr>
+              <w:t>Mejor predictor no-lag</w:t>
+            </w:r>
+          </w:p>
+        </w:tc>
+      </w:tr>
+      <w:tr>
+        <w:tc>
+          <w:tcPr>
+            <w:tcW w:type="dxa" w:w="1824"/>
+          </w:tcPr>
+          <w:p>
+            <w:pPr>
+              <w:jc w:val="left"/>
+            </w:pPr>
+            <w:r>
+              <w:rPr>
+                <w:rFonts w:ascii="Calibri" w:hAnsi="Calibri"/>
+                <w:b w:val="0"/>
+                <w:sz w:val="20"/>
+              </w:rPr>
+              <w:t>clasico_lag_1</w:t>
+            </w:r>
+          </w:p>
+        </w:tc>
+        <w:tc>
+          <w:tcPr>
+            <w:tcW w:type="dxa" w:w="1824"/>
+          </w:tcPr>
+          <w:p>
+            <w:pPr>
+              <w:jc w:val="center"/>
+            </w:pPr>
+            <w:r>
+              <w:rPr>
+                <w:rFonts w:ascii="Calibri" w:hAnsi="Calibri"/>
+                <w:b w:val="0"/>
+                <w:sz w:val="20"/>
+              </w:rPr>
+              <w:t>Rezago clásico</w:t>
+            </w:r>
+          </w:p>
+        </w:tc>
+        <w:tc>
+          <w:tcPr>
+            <w:tcW w:type="dxa" w:w="1824"/>
+          </w:tcPr>
+          <w:p>
+            <w:pPr>
+              <w:jc w:val="center"/>
+            </w:pPr>
+            <w:r>
+              <w:rPr>
+                <w:rFonts w:ascii="Calibri" w:hAnsi="Calibri"/>
+                <w:b w:val="0"/>
+                <w:sz w:val="20"/>
+              </w:rPr>
+              <w:t>98.9%</w:t>
+            </w:r>
+          </w:p>
+        </w:tc>
+        <w:tc>
+          <w:tcPr>
+            <w:tcW w:type="dxa" w:w="1824"/>
+          </w:tcPr>
+          <w:p>
+            <w:pPr>
+              <w:jc w:val="center"/>
+            </w:pPr>
+            <w:r>
+              <w:rPr>
+                <w:rFonts w:ascii="Calibri" w:hAnsi="Calibri"/>
+                <w:b w:val="0"/>
+                <w:sz w:val="20"/>
+              </w:rPr>
+              <w:t>0.371</w:t>
+            </w:r>
+          </w:p>
+        </w:tc>
+        <w:tc>
+          <w:tcPr>
+            <w:tcW w:type="dxa" w:w="1824"/>
+          </w:tcPr>
+          <w:p>
+            <w:pPr>
+              <w:jc w:val="center"/>
+            </w:pPr>
+            <w:r>
+              <w:rPr>
+                <w:rFonts w:ascii="Calibri" w:hAnsi="Calibri"/>
+                <w:b w:val="0"/>
+                <w:sz w:val="20"/>
+              </w:rPr>
+              <w:t>Precursor epidémico</w:t>
             </w:r>
           </w:p>
         </w:tc>
@@ -1099,7 +1284,7 @@
                 <w:b w:val="0"/>
                 <w:sz w:val="20"/>
               </w:rPr>
-              <w:t>99.8%</w:t>
+              <w:t>100.0%</w:t>
             </w:r>
           </w:p>
         </w:tc>
@@ -1117,7 +1302,7 @@
                 <w:b w:val="0"/>
                 <w:sz w:val="20"/>
               </w:rPr>
-              <w:t>0.191</w:t>
+              <w:t>0.352</w:t>
             </w:r>
           </w:p>
         </w:tc>
@@ -1135,7 +1320,6 @@
                 <w:b w:val="0"/>
                 <w:sz w:val="20"/>
               </w:rPr>
-              <w:t>Precursor epidémico</w:t>
             </w:r>
           </w:p>
         </w:tc>
@@ -1191,7 +1375,7 @@
                 <w:b w:val="0"/>
                 <w:sz w:val="20"/>
               </w:rPr>
-              <w:t>99.5%</w:t>
+              <w:t>97.9%</w:t>
             </w:r>
           </w:p>
         </w:tc>
@@ -1209,98 +1393,7 @@
                 <w:b w:val="0"/>
                 <w:sz w:val="20"/>
               </w:rPr>
-              <w:t>0.142</w:t>
-            </w:r>
-          </w:p>
-        </w:tc>
-        <w:tc>
-          <w:tcPr>
-            <w:tcW w:type="dxa" w:w="1824"/>
-          </w:tcPr>
-          <w:p>
-            <w:pPr>
-              <w:jc w:val="center"/>
-            </w:pPr>
-            <w:r>
-              <w:rPr>
-                <w:rFonts w:ascii="Calibri" w:hAnsi="Calibri"/>
-                <w:b w:val="0"/>
-                <w:sz w:val="20"/>
-              </w:rPr>
-            </w:r>
-          </w:p>
-        </w:tc>
-      </w:tr>
-      <w:tr>
-        <w:tc>
-          <w:tcPr>
-            <w:tcW w:type="dxa" w:w="1824"/>
-          </w:tcPr>
-          <w:p>
-            <w:pPr>
-              <w:jc w:val="left"/>
-            </w:pPr>
-            <w:r>
-              <w:rPr>
-                <w:rFonts w:ascii="Calibri" w:hAnsi="Calibri"/>
-                <w:b w:val="0"/>
-                <w:sz w:val="20"/>
-              </w:rPr>
-              <w:t>clasico_lag_1</w:t>
-            </w:r>
-          </w:p>
-        </w:tc>
-        <w:tc>
-          <w:tcPr>
-            <w:tcW w:type="dxa" w:w="1824"/>
-          </w:tcPr>
-          <w:p>
-            <w:pPr>
-              <w:jc w:val="center"/>
-            </w:pPr>
-            <w:r>
-              <w:rPr>
-                <w:rFonts w:ascii="Calibri" w:hAnsi="Calibri"/>
-                <w:b w:val="0"/>
-                <w:sz w:val="20"/>
-              </w:rPr>
-              <w:t>Rezago clásico</w:t>
-            </w:r>
-          </w:p>
-        </w:tc>
-        <w:tc>
-          <w:tcPr>
-            <w:tcW w:type="dxa" w:w="1824"/>
-          </w:tcPr>
-          <w:p>
-            <w:pPr>
-              <w:jc w:val="center"/>
-            </w:pPr>
-            <w:r>
-              <w:rPr>
-                <w:rFonts w:ascii="Calibri" w:hAnsi="Calibri"/>
-                <w:b w:val="0"/>
-                <w:sz w:val="20"/>
-              </w:rPr>
-              <w:t>99.8%</w:t>
-            </w:r>
-          </w:p>
-        </w:tc>
-        <w:tc>
-          <w:tcPr>
-            <w:tcW w:type="dxa" w:w="1824"/>
-          </w:tcPr>
-          <w:p>
-            <w:pPr>
-              <w:jc w:val="center"/>
-            </w:pPr>
-            <w:r>
-              <w:rPr>
-                <w:rFonts w:ascii="Calibri" w:hAnsi="Calibri"/>
-                <w:b w:val="0"/>
-                <w:sz w:val="20"/>
-              </w:rPr>
-              <w:t>0.128</w:t>
+              <w:t>0.349</w:t>
             </w:r>
           </w:p>
         </w:tc>
@@ -1373,7 +1466,7 @@
                 <w:b w:val="0"/>
                 <w:sz w:val="20"/>
               </w:rPr>
-              <w:t>99.3%</w:t>
+              <w:t>97.0%</w:t>
             </w:r>
           </w:p>
         </w:tc>
@@ -1391,7 +1484,7 @@
                 <w:b w:val="0"/>
                 <w:sz w:val="20"/>
               </w:rPr>
-              <w:t>0.127</w:t>
+              <w:t>0.327</w:t>
             </w:r>
           </w:p>
         </w:tc>
@@ -1409,6 +1502,98 @@
                 <w:b w:val="0"/>
                 <w:sz w:val="20"/>
               </w:rPr>
+            </w:r>
+          </w:p>
+        </w:tc>
+      </w:tr>
+      <w:tr>
+        <w:tc>
+          <w:tcPr>
+            <w:tcW w:type="dxa" w:w="1824"/>
+          </w:tcPr>
+          <w:p>
+            <w:pPr>
+              <w:jc w:val="left"/>
+            </w:pPr>
+            <w:r>
+              <w:rPr>
+                <w:rFonts w:ascii="Calibri" w:hAnsi="Calibri"/>
+                <w:b w:val="0"/>
+                <w:sz w:val="20"/>
+              </w:rPr>
+              <w:t>p25</w:t>
+            </w:r>
+          </w:p>
+        </w:tc>
+        <w:tc>
+          <w:tcPr>
+            <w:tcW w:type="dxa" w:w="1824"/>
+          </w:tcPr>
+          <w:p>
+            <w:pPr>
+              <w:jc w:val="center"/>
+            </w:pPr>
+            <w:r>
+              <w:rPr>
+                <w:rFonts w:ascii="Calibri" w:hAnsi="Calibri"/>
+                <w:b w:val="0"/>
+                <w:sz w:val="20"/>
+              </w:rPr>
+              <w:t>Canal endémico</w:t>
+            </w:r>
+          </w:p>
+        </w:tc>
+        <w:tc>
+          <w:tcPr>
+            <w:tcW w:type="dxa" w:w="1824"/>
+          </w:tcPr>
+          <w:p>
+            <w:pPr>
+              <w:jc w:val="center"/>
+            </w:pPr>
+            <w:r>
+              <w:rPr>
+                <w:rFonts w:ascii="Calibri" w:hAnsi="Calibri"/>
+                <w:b w:val="0"/>
+                <w:sz w:val="20"/>
+              </w:rPr>
+              <w:t>99.4%</w:t>
+            </w:r>
+          </w:p>
+        </w:tc>
+        <w:tc>
+          <w:tcPr>
+            <w:tcW w:type="dxa" w:w="1824"/>
+          </w:tcPr>
+          <w:p>
+            <w:pPr>
+              <w:jc w:val="center"/>
+            </w:pPr>
+            <w:r>
+              <w:rPr>
+                <w:rFonts w:ascii="Calibri" w:hAnsi="Calibri"/>
+                <w:b w:val="0"/>
+                <w:sz w:val="20"/>
+              </w:rPr>
+              <w:t>0.322</w:t>
+            </w:r>
+          </w:p>
+        </w:tc>
+        <w:tc>
+          <w:tcPr>
+            <w:tcW w:type="dxa" w:w="1824"/>
+          </w:tcPr>
+          <w:p>
+            <w:pPr>
+              <w:jc w:val="center"/>
+            </w:pPr>
+            <w:r>
+              <w:rPr>
+                <w:rFonts w:ascii="Calibri" w:hAnsi="Calibri"/>
+                <w:b w:val="0"/>
+                <w:sz w:val="20"/>
+              </w:rPr>
+              <w:t>Umbral inferior del canal</w:t>
             </w:r>
           </w:p>
         </w:tc>
@@ -1464,7 +1649,7 @@
                 <w:b w:val="0"/>
                 <w:sz w:val="20"/>
               </w:rPr>
-              <w:t>99.1%</w:t>
+              <w:t>96.0%</w:t>
             </w:r>
           </w:p>
         </w:tc>
@@ -1482,7 +1667,7 @@
                 <w:b w:val="0"/>
                 <w:sz w:val="20"/>
               </w:rPr>
-              <w:t>0.119</w:t>
+              <w:t>0.305</w:t>
             </w:r>
           </w:p>
         </w:tc>
@@ -1519,7 +1704,7 @@
                 <w:b w:val="0"/>
                 <w:sz w:val="20"/>
               </w:rPr>
-              <w:t>clasico_lag_8</w:t>
+              <w:t>clasico_lag_6</w:t>
             </w:r>
           </w:p>
         </w:tc>
@@ -1555,7 +1740,7 @@
                 <w:b w:val="0"/>
                 <w:sz w:val="20"/>
               </w:rPr>
-              <w:t>98.2%</w:t>
+              <w:t>94.2%</w:t>
             </w:r>
           </w:p>
         </w:tc>
@@ -1573,7 +1758,7 @@
                 <w:b w:val="0"/>
                 <w:sz w:val="20"/>
               </w:rPr>
-              <w:t>0.093</w:t>
+              <w:t>0.272</w:t>
             </w:r>
           </w:p>
         </w:tc>
@@ -1610,7 +1795,7 @@
                 <w:b w:val="0"/>
                 <w:sz w:val="20"/>
               </w:rPr>
-              <w:t>p75</w:t>
+              <w:t>zona_canal_lag1</w:t>
             </w:r>
           </w:p>
         </w:tc>
@@ -1646,7 +1831,7 @@
                 <w:b w:val="0"/>
                 <w:sz w:val="20"/>
               </w:rPr>
-              <w:t>99.6%</w:t>
+              <w:t>100.0%</w:t>
             </w:r>
           </w:p>
         </w:tc>
@@ -1664,7 +1849,7 @@
                 <w:b w:val="0"/>
                 <w:sz w:val="20"/>
               </w:rPr>
-              <w:t>0.228</w:t>
+              <w:t>0.237</w:t>
             </w:r>
           </w:p>
         </w:tc>
@@ -1682,7 +1867,190 @@
                 <w:b w:val="0"/>
                 <w:sz w:val="20"/>
               </w:rPr>
-              <w:t>Umbral epidémico histórico</w:t>
+              <w:t>Estado epidémico mes anterior</w:t>
+            </w:r>
+          </w:p>
+        </w:tc>
+      </w:tr>
+      <w:tr>
+        <w:tc>
+          <w:tcPr>
+            <w:tcW w:type="dxa" w:w="1824"/>
+          </w:tcPr>
+          <w:p>
+            <w:pPr>
+              <w:jc w:val="left"/>
+            </w:pPr>
+            <w:r>
+              <w:rPr>
+                <w:rFonts w:ascii="Calibri" w:hAnsi="Calibri"/>
+                <w:b w:val="0"/>
+                <w:sz w:val="20"/>
+              </w:rPr>
+              <w:t>es_endemico</w:t>
+            </w:r>
+          </w:p>
+        </w:tc>
+        <w:tc>
+          <w:tcPr>
+            <w:tcW w:type="dxa" w:w="1824"/>
+          </w:tcPr>
+          <w:p>
+            <w:pPr>
+              <w:jc w:val="center"/>
+            </w:pPr>
+            <w:r>
+              <w:rPr>
+                <w:rFonts w:ascii="Calibri" w:hAnsi="Calibri"/>
+                <w:b w:val="0"/>
+                <w:sz w:val="20"/>
+              </w:rPr>
+              <w:t>Canal endémico</w:t>
+            </w:r>
+          </w:p>
+        </w:tc>
+        <w:tc>
+          <w:tcPr>
+            <w:tcW w:type="dxa" w:w="1824"/>
+          </w:tcPr>
+          <w:p>
+            <w:pPr>
+              <w:jc w:val="center"/>
+            </w:pPr>
+            <w:r>
+              <w:rPr>
+                <w:rFonts w:ascii="Calibri" w:hAnsi="Calibri"/>
+                <w:b w:val="0"/>
+                <w:sz w:val="20"/>
+              </w:rPr>
+              <w:t>100.0%</w:t>
+            </w:r>
+          </w:p>
+        </w:tc>
+        <w:tc>
+          <w:tcPr>
+            <w:tcW w:type="dxa" w:w="1824"/>
+          </w:tcPr>
+          <w:p>
+            <w:pPr>
+              <w:jc w:val="center"/>
+            </w:pPr>
+            <w:r>
+              <w:rPr>
+                <w:rFonts w:ascii="Calibri" w:hAnsi="Calibri"/>
+                <w:b w:val="0"/>
+                <w:sz w:val="20"/>
+              </w:rPr>
+              <w:t>0.176</w:t>
+            </w:r>
+          </w:p>
+        </w:tc>
+        <w:tc>
+          <w:tcPr>
+            <w:tcW w:type="dxa" w:w="1824"/>
+          </w:tcPr>
+          <w:p>
+            <w:pPr>
+              <w:jc w:val="center"/>
+            </w:pPr>
+            <w:r>
+              <w:rPr>
+                <w:rFonts w:ascii="Calibri" w:hAnsi="Calibri"/>
+                <w:b w:val="0"/>
+                <w:sz w:val="20"/>
+              </w:rPr>
+            </w:r>
+          </w:p>
+        </w:tc>
+      </w:tr>
+      <w:tr>
+        <w:tc>
+          <w:tcPr>
+            <w:tcW w:type="dxa" w:w="1824"/>
+          </w:tcPr>
+          <w:p>
+            <w:pPr>
+              <w:jc w:val="left"/>
+            </w:pPr>
+            <w:r>
+              <w:rPr>
+                <w:rFonts w:ascii="Calibri" w:hAnsi="Calibri"/>
+                <w:b w:val="0"/>
+                <w:sz w:val="20"/>
+              </w:rPr>
+              <w:t>sir_lag1</w:t>
+            </w:r>
+          </w:p>
+        </w:tc>
+        <w:tc>
+          <w:tcPr>
+            <w:tcW w:type="dxa" w:w="1824"/>
+          </w:tcPr>
+          <w:p>
+            <w:pPr>
+              <w:jc w:val="center"/>
+            </w:pPr>
+            <w:r>
+              <w:rPr>
+                <w:rFonts w:ascii="Calibri" w:hAnsi="Calibri"/>
+                <w:b w:val="0"/>
+                <w:sz w:val="20"/>
+              </w:rPr>
+              <w:t>Canal endémico</w:t>
+            </w:r>
+          </w:p>
+        </w:tc>
+        <w:tc>
+          <w:tcPr>
+            <w:tcW w:type="dxa" w:w="1824"/>
+          </w:tcPr>
+          <w:p>
+            <w:pPr>
+              <w:jc w:val="center"/>
+            </w:pPr>
+            <w:r>
+              <w:rPr>
+                <w:rFonts w:ascii="Calibri" w:hAnsi="Calibri"/>
+                <w:b w:val="0"/>
+                <w:sz w:val="20"/>
+              </w:rPr>
+              <w:t>63.6%</w:t>
+            </w:r>
+          </w:p>
+        </w:tc>
+        <w:tc>
+          <w:tcPr>
+            <w:tcW w:type="dxa" w:w="1824"/>
+          </w:tcPr>
+          <w:p>
+            <w:pPr>
+              <w:jc w:val="center"/>
+            </w:pPr>
+            <w:r>
+              <w:rPr>
+                <w:rFonts w:ascii="Calibri" w:hAnsi="Calibri"/>
+                <w:b w:val="0"/>
+                <w:sz w:val="20"/>
+              </w:rPr>
+              <w:t>0.095</w:t>
+            </w:r>
+          </w:p>
+        </w:tc>
+        <w:tc>
+          <w:tcPr>
+            <w:tcW w:type="dxa" w:w="1824"/>
+          </w:tcPr>
+          <w:p>
+            <w:pPr>
+              <w:jc w:val="center"/>
+            </w:pPr>
+            <w:r>
+              <w:rPr>
+                <w:rFonts w:ascii="Calibri" w:hAnsi="Calibri"/>
+                <w:b w:val="0"/>
+                <w:sz w:val="20"/>
+              </w:rPr>
+              <w:t>Ratio casos / media histórica municipio-mes</w:t>
             </w:r>
           </w:p>
         </w:tc>
@@ -1756,7 +2124,7 @@
                 <w:b w:val="0"/>
                 <w:sz w:val="20"/>
               </w:rPr>
-              <w:t>−0.124</w:t>
+              <w:t>−0.100</w:t>
             </w:r>
           </w:p>
         </w:tc>
@@ -1774,7 +2142,7 @@
                 <w:b w:val="0"/>
                 <w:sz w:val="20"/>
               </w:rPr>
-              <w:t>Tendencia decreciente a largo plazo</w:t>
+              <w:t>Tendencia decreciente largo plazo</w:t>
             </w:r>
           </w:p>
         </w:tc>
@@ -1794,7 +2162,7 @@
                 <w:b w:val="0"/>
                 <w:sz w:val="20"/>
               </w:rPr>
-              <w:t>zona_canal_lag1</w:t>
+              <w:t>anio_epidemia</w:t>
             </w:r>
           </w:p>
         </w:tc>
@@ -1812,99 +2180,7 @@
                 <w:b w:val="0"/>
                 <w:sz w:val="20"/>
               </w:rPr>
-              <w:t>Canal endémico</w:t>
-            </w:r>
-          </w:p>
-        </w:tc>
-        <w:tc>
-          <w:tcPr>
-            <w:tcW w:type="dxa" w:w="1824"/>
-          </w:tcPr>
-          <w:p>
-            <w:pPr>
-              <w:jc w:val="center"/>
-            </w:pPr>
-            <w:r>
-              <w:rPr>
-                <w:rFonts w:ascii="Calibri" w:hAnsi="Calibri"/>
-                <w:b w:val="0"/>
-                <w:sz w:val="20"/>
-              </w:rPr>
-              <w:t>99.3%</w:t>
-            </w:r>
-          </w:p>
-        </w:tc>
-        <w:tc>
-          <w:tcPr>
-            <w:tcW w:type="dxa" w:w="1824"/>
-          </w:tcPr>
-          <w:p>
-            <w:pPr>
-              <w:jc w:val="center"/>
-            </w:pPr>
-            <w:r>
-              <w:rPr>
-                <w:rFonts w:ascii="Calibri" w:hAnsi="Calibri"/>
-                <w:b w:val="0"/>
-                <w:sz w:val="20"/>
-              </w:rPr>
-              <w:t>−0.101</w:t>
-            </w:r>
-          </w:p>
-        </w:tc>
-        <w:tc>
-          <w:tcPr>
-            <w:tcW w:type="dxa" w:w="1824"/>
-          </w:tcPr>
-          <w:p>
-            <w:pPr>
-              <w:jc w:val="center"/>
-            </w:pPr>
-            <w:r>
-              <w:rPr>
-                <w:rFonts w:ascii="Calibri" w:hAnsi="Calibri"/>
-                <w:b w:val="0"/>
-                <w:sz w:val="20"/>
-              </w:rPr>
-              <w:t>Zona epidémica semana anterior</w:t>
-            </w:r>
-          </w:p>
-        </w:tc>
-      </w:tr>
-      <w:tr>
-        <w:tc>
-          <w:tcPr>
-            <w:tcW w:type="dxa" w:w="1824"/>
-          </w:tcPr>
-          <w:p>
-            <w:pPr>
-              <w:jc w:val="left"/>
-            </w:pPr>
-            <w:r>
-              <w:rPr>
-                <w:rFonts w:ascii="Calibri" w:hAnsi="Calibri"/>
-                <w:b w:val="0"/>
-                <w:sz w:val="20"/>
-              </w:rPr>
-              <w:t>es_endemico</w:t>
-            </w:r>
-          </w:p>
-        </w:tc>
-        <w:tc>
-          <w:tcPr>
-            <w:tcW w:type="dxa" w:w="1824"/>
-          </w:tcPr>
-          <w:p>
-            <w:pPr>
-              <w:jc w:val="center"/>
-            </w:pPr>
-            <w:r>
-              <w:rPr>
-                <w:rFonts w:ascii="Calibri" w:hAnsi="Calibri"/>
-                <w:b w:val="0"/>
-                <w:sz w:val="20"/>
-              </w:rPr>
-              <w:t>Canal endémico</w:t>
+              <w:t>Temporal</w:t>
             </w:r>
           </w:p>
         </w:tc>
@@ -1940,7 +2216,7 @@
                 <w:b w:val="0"/>
                 <w:sz w:val="20"/>
               </w:rPr>
-              <w:t>0.023</w:t>
+              <w:t>−0.100</w:t>
             </w:r>
           </w:p>
         </w:tc>
@@ -1958,6 +2234,7 @@
                 <w:b w:val="0"/>
                 <w:sz w:val="20"/>
               </w:rPr>
+              <w:t>Tendencia continua desde 2007</w:t>
             </w:r>
           </w:p>
         </w:tc>
@@ -1977,7 +2254,7 @@
                 <w:b w:val="0"/>
                 <w:sz w:val="20"/>
               </w:rPr>
-              <w:t>p25</w:t>
+              <w:t>MES</w:t>
             </w:r>
           </w:p>
         </w:tc>
@@ -1995,7 +2272,7 @@
                 <w:b w:val="0"/>
                 <w:sz w:val="20"/>
               </w:rPr>
-              <w:t>Canal endémico</w:t>
+              <w:t>Temporal</w:t>
             </w:r>
           </w:p>
         </w:tc>
@@ -2013,7 +2290,7 @@
                 <w:b w:val="0"/>
                 <w:sz w:val="20"/>
               </w:rPr>
-              <w:t>99.6%</w:t>
+              <w:t>100%</w:t>
             </w:r>
           </w:p>
         </w:tc>
@@ -2031,372 +2308,7 @@
                 <w:b w:val="0"/>
                 <w:sz w:val="20"/>
               </w:rPr>
-              <w:t>0.020</w:t>
-            </w:r>
-          </w:p>
-        </w:tc>
-        <w:tc>
-          <w:tcPr>
-            <w:tcW w:type="dxa" w:w="1824"/>
-          </w:tcPr>
-          <w:p>
-            <w:pPr>
-              <w:jc w:val="center"/>
-            </w:pPr>
-            <w:r>
-              <w:rPr>
-                <w:rFonts w:ascii="Calibri" w:hAnsi="Calibri"/>
-                <w:b w:val="0"/>
-                <w:sz w:val="20"/>
-              </w:rPr>
-            </w:r>
-          </w:p>
-        </w:tc>
-      </w:tr>
-      <w:tr>
-        <w:tc>
-          <w:tcPr>
-            <w:tcW w:type="dxa" w:w="1824"/>
-          </w:tcPr>
-          <w:p>
-            <w:pPr>
-              <w:jc w:val="left"/>
-            </w:pPr>
-            <w:r>
-              <w:rPr>
-                <w:rFonts w:ascii="Calibri" w:hAnsi="Calibri"/>
-                <w:b w:val="0"/>
-                <w:sz w:val="20"/>
-              </w:rPr>
-              <w:t>lst_media</w:t>
-            </w:r>
-          </w:p>
-        </w:tc>
-        <w:tc>
-          <w:tcPr>
-            <w:tcW w:type="dxa" w:w="1824"/>
-          </w:tcPr>
-          <w:p>
-            <w:pPr>
-              <w:jc w:val="center"/>
-            </w:pPr>
-            <w:r>
-              <w:rPr>
-                <w:rFonts w:ascii="Calibri" w:hAnsi="Calibri"/>
-                <w:b w:val="0"/>
-                <w:sz w:val="20"/>
-              </w:rPr>
-              <w:t>Temperatura LST</w:t>
-            </w:r>
-          </w:p>
-        </w:tc>
-        <w:tc>
-          <w:tcPr>
-            <w:tcW w:type="dxa" w:w="1824"/>
-          </w:tcPr>
-          <w:p>
-            <w:pPr>
-              <w:jc w:val="center"/>
-            </w:pPr>
-            <w:r>
-              <w:rPr>
-                <w:rFonts w:ascii="Calibri" w:hAnsi="Calibri"/>
-                <w:b w:val="0"/>
-                <w:sz w:val="20"/>
-              </w:rPr>
-              <w:t>83.5%</w:t>
-            </w:r>
-          </w:p>
-        </w:tc>
-        <w:tc>
-          <w:tcPr>
-            <w:tcW w:type="dxa" w:w="1824"/>
-          </w:tcPr>
-          <w:p>
-            <w:pPr>
-              <w:jc w:val="center"/>
-            </w:pPr>
-            <w:r>
-              <w:rPr>
-                <w:rFonts w:ascii="Calibri" w:hAnsi="Calibri"/>
-                <w:b w:val="0"/>
-                <w:sz w:val="20"/>
-              </w:rPr>
-              <w:t>0.015</w:t>
-            </w:r>
-          </w:p>
-        </w:tc>
-        <w:tc>
-          <w:tcPr>
-            <w:tcW w:type="dxa" w:w="1824"/>
-          </w:tcPr>
-          <w:p>
-            <w:pPr>
-              <w:jc w:val="center"/>
-            </w:pPr>
-            <w:r>
-              <w:rPr>
-                <w:rFonts w:ascii="Calibri" w:hAnsi="Calibri"/>
-                <w:b w:val="0"/>
-                <w:sz w:val="20"/>
-              </w:rPr>
-              <w:t>Relación no lineal esperada</w:t>
-            </w:r>
-          </w:p>
-        </w:tc>
-      </w:tr>
-      <w:tr>
-        <w:tc>
-          <w:tcPr>
-            <w:tcW w:type="dxa" w:w="1824"/>
-          </w:tcPr>
-          <w:p>
-            <w:pPr>
-              <w:jc w:val="left"/>
-            </w:pPr>
-            <w:r>
-              <w:rPr>
-                <w:rFonts w:ascii="Calibri" w:hAnsi="Calibri"/>
-                <w:b w:val="0"/>
-                <w:sz w:val="20"/>
-              </w:rPr>
-              <w:t>lst_lag_1</w:t>
-            </w:r>
-          </w:p>
-        </w:tc>
-        <w:tc>
-          <w:tcPr>
-            <w:tcW w:type="dxa" w:w="1824"/>
-          </w:tcPr>
-          <w:p>
-            <w:pPr>
-              <w:jc w:val="center"/>
-            </w:pPr>
-            <w:r>
-              <w:rPr>
-                <w:rFonts w:ascii="Calibri" w:hAnsi="Calibri"/>
-                <w:b w:val="0"/>
-                <w:sz w:val="20"/>
-              </w:rPr>
-              <w:t>Temperatura LST</w:t>
-            </w:r>
-          </w:p>
-        </w:tc>
-        <w:tc>
-          <w:tcPr>
-            <w:tcW w:type="dxa" w:w="1824"/>
-          </w:tcPr>
-          <w:p>
-            <w:pPr>
-              <w:jc w:val="center"/>
-            </w:pPr>
-            <w:r>
-              <w:rPr>
-                <w:rFonts w:ascii="Calibri" w:hAnsi="Calibri"/>
-                <w:b w:val="0"/>
-                <w:sz w:val="20"/>
-              </w:rPr>
-              <w:t>83.2%</w:t>
-            </w:r>
-          </w:p>
-        </w:tc>
-        <w:tc>
-          <w:tcPr>
-            <w:tcW w:type="dxa" w:w="1824"/>
-          </w:tcPr>
-          <w:p>
-            <w:pPr>
-              <w:jc w:val="center"/>
-            </w:pPr>
-            <w:r>
-              <w:rPr>
-                <w:rFonts w:ascii="Calibri" w:hAnsi="Calibri"/>
-                <w:b w:val="0"/>
-                <w:sz w:val="20"/>
-              </w:rPr>
-              <w:t>0.014</w:t>
-            </w:r>
-          </w:p>
-        </w:tc>
-        <w:tc>
-          <w:tcPr>
-            <w:tcW w:type="dxa" w:w="1824"/>
-          </w:tcPr>
-          <w:p>
-            <w:pPr>
-              <w:jc w:val="center"/>
-            </w:pPr>
-            <w:r>
-              <w:rPr>
-                <w:rFonts w:ascii="Calibri" w:hAnsi="Calibri"/>
-                <w:b w:val="0"/>
-                <w:sz w:val="20"/>
-              </w:rPr>
-            </w:r>
-          </w:p>
-        </w:tc>
-      </w:tr>
-      <w:tr>
-        <w:tc>
-          <w:tcPr>
-            <w:tcW w:type="dxa" w:w="1824"/>
-          </w:tcPr>
-          <w:p>
-            <w:pPr>
-              <w:jc w:val="left"/>
-            </w:pPr>
-            <w:r>
-              <w:rPr>
-                <w:rFonts w:ascii="Calibri" w:hAnsi="Calibri"/>
-                <w:b w:val="0"/>
-                <w:sz w:val="20"/>
-              </w:rPr>
-              <w:t>lst_lag_2</w:t>
-            </w:r>
-          </w:p>
-        </w:tc>
-        <w:tc>
-          <w:tcPr>
-            <w:tcW w:type="dxa" w:w="1824"/>
-          </w:tcPr>
-          <w:p>
-            <w:pPr>
-              <w:jc w:val="center"/>
-            </w:pPr>
-            <w:r>
-              <w:rPr>
-                <w:rFonts w:ascii="Calibri" w:hAnsi="Calibri"/>
-                <w:b w:val="0"/>
-                <w:sz w:val="20"/>
-              </w:rPr>
-              <w:t>Temperatura LST</w:t>
-            </w:r>
-          </w:p>
-        </w:tc>
-        <w:tc>
-          <w:tcPr>
-            <w:tcW w:type="dxa" w:w="1824"/>
-          </w:tcPr>
-          <w:p>
-            <w:pPr>
-              <w:jc w:val="center"/>
-            </w:pPr>
-            <w:r>
-              <w:rPr>
-                <w:rFonts w:ascii="Calibri" w:hAnsi="Calibri"/>
-                <w:b w:val="0"/>
-                <w:sz w:val="20"/>
-              </w:rPr>
-              <w:t>82.9%</w:t>
-            </w:r>
-          </w:p>
-        </w:tc>
-        <w:tc>
-          <w:tcPr>
-            <w:tcW w:type="dxa" w:w="1824"/>
-          </w:tcPr>
-          <w:p>
-            <w:pPr>
-              <w:jc w:val="center"/>
-            </w:pPr>
-            <w:r>
-              <w:rPr>
-                <w:rFonts w:ascii="Calibri" w:hAnsi="Calibri"/>
-                <w:b w:val="0"/>
-                <w:sz w:val="20"/>
-              </w:rPr>
-              <w:t>0.013</w:t>
-            </w:r>
-          </w:p>
-        </w:tc>
-        <w:tc>
-          <w:tcPr>
-            <w:tcW w:type="dxa" w:w="1824"/>
-          </w:tcPr>
-          <w:p>
-            <w:pPr>
-              <w:jc w:val="center"/>
-            </w:pPr>
-            <w:r>
-              <w:rPr>
-                <w:rFonts w:ascii="Calibri" w:hAnsi="Calibri"/>
-                <w:b w:val="0"/>
-                <w:sz w:val="20"/>
-              </w:rPr>
-            </w:r>
-          </w:p>
-        </w:tc>
-      </w:tr>
-      <w:tr>
-        <w:tc>
-          <w:tcPr>
-            <w:tcW w:type="dxa" w:w="1824"/>
-          </w:tcPr>
-          <w:p>
-            <w:pPr>
-              <w:jc w:val="left"/>
-            </w:pPr>
-            <w:r>
-              <w:rPr>
-                <w:rFonts w:ascii="Calibri" w:hAnsi="Calibri"/>
-                <w:b w:val="0"/>
-                <w:sz w:val="20"/>
-              </w:rPr>
-              <w:t>lst_lag_4</w:t>
-            </w:r>
-          </w:p>
-        </w:tc>
-        <w:tc>
-          <w:tcPr>
-            <w:tcW w:type="dxa" w:w="1824"/>
-          </w:tcPr>
-          <w:p>
-            <w:pPr>
-              <w:jc w:val="center"/>
-            </w:pPr>
-            <w:r>
-              <w:rPr>
-                <w:rFonts w:ascii="Calibri" w:hAnsi="Calibri"/>
-                <w:b w:val="0"/>
-                <w:sz w:val="20"/>
-              </w:rPr>
-              <w:t>Temperatura LST</w:t>
-            </w:r>
-          </w:p>
-        </w:tc>
-        <w:tc>
-          <w:tcPr>
-            <w:tcW w:type="dxa" w:w="1824"/>
-          </w:tcPr>
-          <w:p>
-            <w:pPr>
-              <w:jc w:val="center"/>
-            </w:pPr>
-            <w:r>
-              <w:rPr>
-                <w:rFonts w:ascii="Calibri" w:hAnsi="Calibri"/>
-                <w:b w:val="0"/>
-                <w:sz w:val="20"/>
-              </w:rPr>
-              <w:t>82.3%</w:t>
-            </w:r>
-          </w:p>
-        </w:tc>
-        <w:tc>
-          <w:tcPr>
-            <w:tcW w:type="dxa" w:w="1824"/>
-          </w:tcPr>
-          <w:p>
-            <w:pPr>
-              <w:jc w:val="center"/>
-            </w:pPr>
-            <w:r>
-              <w:rPr>
-                <w:rFonts w:ascii="Calibri" w:hAnsi="Calibri"/>
-                <w:b w:val="0"/>
-                <w:sz w:val="20"/>
-              </w:rPr>
-              <w:t>0.013</w:t>
+              <w:t>−0.006</w:t>
             </w:r>
           </w:p>
         </w:tc>
@@ -2487,7 +2399,7 @@
                 <w:b w:val="0"/>
                 <w:sz w:val="20"/>
               </w:rPr>
-              <w:t>0.012</w:t>
+              <w:t>0.005</w:t>
             </w:r>
           </w:p>
         </w:tc>
@@ -2505,190 +2417,7 @@
                 <w:b w:val="0"/>
                 <w:sz w:val="20"/>
               </w:rPr>
-              <w:t>Estacionalidad anual</w:t>
-            </w:r>
-          </w:p>
-        </w:tc>
-      </w:tr>
-      <w:tr>
-        <w:tc>
-          <w:tcPr>
-            <w:tcW w:type="dxa" w:w="1824"/>
-          </w:tcPr>
-          <w:p>
-            <w:pPr>
-              <w:jc w:val="left"/>
-            </w:pPr>
-            <w:r>
-              <w:rPr>
-                <w:rFonts w:ascii="Calibri" w:hAnsi="Calibri"/>
-                <w:b w:val="0"/>
-                <w:sz w:val="20"/>
-              </w:rPr>
-              <w:t>SEMANA</w:t>
-            </w:r>
-          </w:p>
-        </w:tc>
-        <w:tc>
-          <w:tcPr>
-            <w:tcW w:type="dxa" w:w="1824"/>
-          </w:tcPr>
-          <w:p>
-            <w:pPr>
-              <w:jc w:val="center"/>
-            </w:pPr>
-            <w:r>
-              <w:rPr>
-                <w:rFonts w:ascii="Calibri" w:hAnsi="Calibri"/>
-                <w:b w:val="0"/>
-                <w:sz w:val="20"/>
-              </w:rPr>
-              <w:t>Temporal</w:t>
-            </w:r>
-          </w:p>
-        </w:tc>
-        <w:tc>
-          <w:tcPr>
-            <w:tcW w:type="dxa" w:w="1824"/>
-          </w:tcPr>
-          <w:p>
-            <w:pPr>
-              <w:jc w:val="center"/>
-            </w:pPr>
-            <w:r>
-              <w:rPr>
-                <w:rFonts w:ascii="Calibri" w:hAnsi="Calibri"/>
-                <w:b w:val="0"/>
-                <w:sz w:val="20"/>
-              </w:rPr>
-              <w:t>100%</w:t>
-            </w:r>
-          </w:p>
-        </w:tc>
-        <w:tc>
-          <w:tcPr>
-            <w:tcW w:type="dxa" w:w="1824"/>
-          </w:tcPr>
-          <w:p>
-            <w:pPr>
-              <w:jc w:val="center"/>
-            </w:pPr>
-            <w:r>
-              <w:rPr>
-                <w:rFonts w:ascii="Calibri" w:hAnsi="Calibri"/>
-                <w:b w:val="0"/>
-                <w:sz w:val="20"/>
-              </w:rPr>
-              <w:t>−0.014</w:t>
-            </w:r>
-          </w:p>
-        </w:tc>
-        <w:tc>
-          <w:tcPr>
-            <w:tcW w:type="dxa" w:w="1824"/>
-          </w:tcPr>
-          <w:p>
-            <w:pPr>
-              <w:jc w:val="center"/>
-            </w:pPr>
-            <w:r>
-              <w:rPr>
-                <w:rFonts w:ascii="Calibri" w:hAnsi="Calibri"/>
-                <w:b w:val="0"/>
-                <w:sz w:val="20"/>
-              </w:rPr>
-            </w:r>
-          </w:p>
-        </w:tc>
-      </w:tr>
-      <w:tr>
-        <w:tc>
-          <w:tcPr>
-            <w:tcW w:type="dxa" w:w="1824"/>
-          </w:tcPr>
-          <w:p>
-            <w:pPr>
-              <w:jc w:val="left"/>
-            </w:pPr>
-            <w:r>
-              <w:rPr>
-                <w:rFonts w:ascii="Calibri" w:hAnsi="Calibri"/>
-                <w:b w:val="0"/>
-                <w:sz w:val="20"/>
-              </w:rPr>
-              <w:t>anio_epidemia</w:t>
-            </w:r>
-          </w:p>
-        </w:tc>
-        <w:tc>
-          <w:tcPr>
-            <w:tcW w:type="dxa" w:w="1824"/>
-          </w:tcPr>
-          <w:p>
-            <w:pPr>
-              <w:jc w:val="center"/>
-            </w:pPr>
-            <w:r>
-              <w:rPr>
-                <w:rFonts w:ascii="Calibri" w:hAnsi="Calibri"/>
-                <w:b w:val="0"/>
-                <w:sz w:val="20"/>
-              </w:rPr>
-              <w:t>Temporal</w:t>
-            </w:r>
-          </w:p>
-        </w:tc>
-        <w:tc>
-          <w:tcPr>
-            <w:tcW w:type="dxa" w:w="1824"/>
-          </w:tcPr>
-          <w:p>
-            <w:pPr>
-              <w:jc w:val="center"/>
-            </w:pPr>
-            <w:r>
-              <w:rPr>
-                <w:rFonts w:ascii="Calibri" w:hAnsi="Calibri"/>
-                <w:b w:val="0"/>
-                <w:sz w:val="20"/>
-              </w:rPr>
-              <w:t>100%</w:t>
-            </w:r>
-          </w:p>
-        </w:tc>
-        <w:tc>
-          <w:tcPr>
-            <w:tcW w:type="dxa" w:w="1824"/>
-          </w:tcPr>
-          <w:p>
-            <w:pPr>
-              <w:jc w:val="center"/>
-            </w:pPr>
-            <w:r>
-              <w:rPr>
-                <w:rFonts w:ascii="Calibri" w:hAnsi="Calibri"/>
-                <w:b w:val="0"/>
-                <w:sz w:val="20"/>
-              </w:rPr>
-              <w:t>0.004</w:t>
-            </w:r>
-          </w:p>
-        </w:tc>
-        <w:tc>
-          <w:tcPr>
-            <w:tcW w:type="dxa" w:w="1824"/>
-          </w:tcPr>
-          <w:p>
-            <w:pPr>
-              <w:jc w:val="center"/>
-            </w:pPr>
-            <w:r>
-              <w:rPr>
-                <w:rFonts w:ascii="Calibri" w:hAnsi="Calibri"/>
-                <w:b w:val="0"/>
-                <w:sz w:val="20"/>
-              </w:rPr>
-              <w:t>Años epidémicos: 2010,2016,2019,2023</w:t>
+              <w:t>Estacionalidad cíclica mensual</w:t>
             </w:r>
           </w:p>
         </w:tc>
@@ -2762,7 +2491,7 @@
                 <w:b w:val="0"/>
                 <w:sz w:val="20"/>
               </w:rPr>
-              <w:t>−0.004</w:t>
+              <w:t>−0.005</w:t>
             </w:r>
           </w:p>
         </w:tc>
@@ -2799,7 +2528,7 @@
                 <w:b w:val="0"/>
                 <w:sz w:val="20"/>
               </w:rPr>
-              <w:t>sir_lag1</w:t>
+              <w:t>temp_mean_c</w:t>
             </w:r>
           </w:p>
         </w:tc>
@@ -2817,7 +2546,7 @@
                 <w:b w:val="0"/>
                 <w:sz w:val="20"/>
               </w:rPr>
-              <w:t>Canal endémico</w:t>
+              <w:t>Temperatura ERA5</w:t>
             </w:r>
           </w:p>
         </w:tc>
@@ -2835,7 +2564,7 @@
                 <w:b w:val="0"/>
                 <w:sz w:val="20"/>
               </w:rPr>
-              <w:t>61.4%</w:t>
+              <w:t>96.4%</w:t>
             </w:r>
           </w:p>
         </w:tc>
@@ -2853,7 +2582,7 @@
                 <w:b w:val="0"/>
                 <w:sz w:val="20"/>
               </w:rPr>
-              <w:t>N/A</w:t>
+              <w:t>−0.022</w:t>
             </w:r>
           </w:p>
         </w:tc>
@@ -2871,8 +2600,483 @@
                 <w:b w:val="0"/>
                 <w:sz w:val="20"/>
               </w:rPr>
-              <w:t>Ratio casos sem. anterior / media historica municipio-semana</w:t>
+              <w:t>Relación no lineal con vector</w:t>
             </w:r>
+          </w:p>
+        </w:tc>
+      </w:tr>
+      <w:tr>
+        <w:tc>
+          <w:tcPr>
+            <w:tcW w:type="dxa" w:w="1824"/>
+          </w:tcPr>
+          <w:p>
+            <w:pPr>
+              <w:jc w:val="left"/>
+            </w:pPr>
+            <w:r>
+              <w:rPr>
+                <w:rFonts w:ascii="Calibri" w:hAnsi="Calibri"/>
+                <w:b w:val="0"/>
+                <w:sz w:val="20"/>
+              </w:rPr>
+              <w:t>temp_lag_1</w:t>
+            </w:r>
+          </w:p>
+        </w:tc>
+        <w:tc>
+          <w:tcPr>
+            <w:tcW w:type="dxa" w:w="1824"/>
+          </w:tcPr>
+          <w:p>
+            <w:pPr>
+              <w:jc w:val="center"/>
+            </w:pPr>
+            <w:r>
+              <w:rPr>
+                <w:rFonts w:ascii="Calibri" w:hAnsi="Calibri"/>
+                <w:b w:val="0"/>
+                <w:sz w:val="20"/>
+              </w:rPr>
+              <w:t>Temperatura ERA5</w:t>
+            </w:r>
+          </w:p>
+        </w:tc>
+        <w:tc>
+          <w:tcPr>
+            <w:tcW w:type="dxa" w:w="1824"/>
+          </w:tcPr>
+          <w:p>
+            <w:pPr>
+              <w:jc w:val="center"/>
+            </w:pPr>
+            <w:r>
+              <w:rPr>
+                <w:rFonts w:ascii="Calibri" w:hAnsi="Calibri"/>
+                <w:b w:val="0"/>
+                <w:sz w:val="20"/>
+              </w:rPr>
+              <w:t>95.4%</w:t>
+            </w:r>
+          </w:p>
+        </w:tc>
+        <w:tc>
+          <w:tcPr>
+            <w:tcW w:type="dxa" w:w="1824"/>
+          </w:tcPr>
+          <w:p>
+            <w:pPr>
+              <w:jc w:val="center"/>
+            </w:pPr>
+            <w:r>
+              <w:rPr>
+                <w:rFonts w:ascii="Calibri" w:hAnsi="Calibri"/>
+                <w:b w:val="0"/>
+                <w:sz w:val="20"/>
+              </w:rPr>
+              <w:t>−0.022</w:t>
+            </w:r>
+          </w:p>
+        </w:tc>
+        <w:tc>
+          <w:tcPr>
+            <w:tcW w:type="dxa" w:w="1824"/>
+          </w:tcPr>
+          <w:p>
+            <w:pPr>
+              <w:jc w:val="center"/>
+            </w:pPr>
+            <w:r>
+              <w:rPr>
+                <w:rFonts w:ascii="Calibri" w:hAnsi="Calibri"/>
+                <w:b w:val="0"/>
+                <w:sz w:val="20"/>
+              </w:rPr>
+            </w:r>
+          </w:p>
+        </w:tc>
+      </w:tr>
+      <w:tr>
+        <w:tc>
+          <w:tcPr>
+            <w:tcW w:type="dxa" w:w="1824"/>
+          </w:tcPr>
+          <w:p>
+            <w:pPr>
+              <w:jc w:val="left"/>
+            </w:pPr>
+            <w:r>
+              <w:rPr>
+                <w:rFonts w:ascii="Calibri" w:hAnsi="Calibri"/>
+                <w:b w:val="0"/>
+                <w:sz w:val="20"/>
+              </w:rPr>
+              <w:t>temp_lag_2</w:t>
+            </w:r>
+          </w:p>
+        </w:tc>
+        <w:tc>
+          <w:tcPr>
+            <w:tcW w:type="dxa" w:w="1824"/>
+          </w:tcPr>
+          <w:p>
+            <w:pPr>
+              <w:jc w:val="center"/>
+            </w:pPr>
+            <w:r>
+              <w:rPr>
+                <w:rFonts w:ascii="Calibri" w:hAnsi="Calibri"/>
+                <w:b w:val="0"/>
+                <w:sz w:val="20"/>
+              </w:rPr>
+              <w:t>Temperatura ERA5</w:t>
+            </w:r>
+          </w:p>
+        </w:tc>
+        <w:tc>
+          <w:tcPr>
+            <w:tcW w:type="dxa" w:w="1824"/>
+          </w:tcPr>
+          <w:p>
+            <w:pPr>
+              <w:jc w:val="center"/>
+            </w:pPr>
+            <w:r>
+              <w:rPr>
+                <w:rFonts w:ascii="Calibri" w:hAnsi="Calibri"/>
+                <w:b w:val="0"/>
+                <w:sz w:val="20"/>
+              </w:rPr>
+              <w:t>94.5%</w:t>
+            </w:r>
+          </w:p>
+        </w:tc>
+        <w:tc>
+          <w:tcPr>
+            <w:tcW w:type="dxa" w:w="1824"/>
+          </w:tcPr>
+          <w:p>
+            <w:pPr>
+              <w:jc w:val="center"/>
+            </w:pPr>
+            <w:r>
+              <w:rPr>
+                <w:rFonts w:ascii="Calibri" w:hAnsi="Calibri"/>
+                <w:b w:val="0"/>
+                <w:sz w:val="20"/>
+              </w:rPr>
+              <w:t>−0.022</w:t>
+            </w:r>
+          </w:p>
+        </w:tc>
+        <w:tc>
+          <w:tcPr>
+            <w:tcW w:type="dxa" w:w="1824"/>
+          </w:tcPr>
+          <w:p>
+            <w:pPr>
+              <w:jc w:val="center"/>
+            </w:pPr>
+            <w:r>
+              <w:rPr>
+                <w:rFonts w:ascii="Calibri" w:hAnsi="Calibri"/>
+                <w:b w:val="0"/>
+                <w:sz w:val="20"/>
+              </w:rPr>
+            </w:r>
+          </w:p>
+        </w:tc>
+      </w:tr>
+      <w:tr>
+        <w:tc>
+          <w:tcPr>
+            <w:tcW w:type="dxa" w:w="1824"/>
+          </w:tcPr>
+          <w:p>
+            <w:pPr>
+              <w:jc w:val="left"/>
+            </w:pPr>
+            <w:r>
+              <w:rPr>
+                <w:rFonts w:ascii="Calibri" w:hAnsi="Calibri"/>
+                <w:b w:val="0"/>
+                <w:sz w:val="20"/>
+              </w:rPr>
+              <w:t>temp_lag_3</w:t>
+            </w:r>
+          </w:p>
+        </w:tc>
+        <w:tc>
+          <w:tcPr>
+            <w:tcW w:type="dxa" w:w="1824"/>
+          </w:tcPr>
+          <w:p>
+            <w:pPr>
+              <w:jc w:val="center"/>
+            </w:pPr>
+            <w:r>
+              <w:rPr>
+                <w:rFonts w:ascii="Calibri" w:hAnsi="Calibri"/>
+                <w:b w:val="0"/>
+                <w:sz w:val="20"/>
+              </w:rPr>
+              <w:t>Temperatura ERA5</w:t>
+            </w:r>
+          </w:p>
+        </w:tc>
+        <w:tc>
+          <w:tcPr>
+            <w:tcW w:type="dxa" w:w="1824"/>
+          </w:tcPr>
+          <w:p>
+            <w:pPr>
+              <w:jc w:val="center"/>
+            </w:pPr>
+            <w:r>
+              <w:rPr>
+                <w:rFonts w:ascii="Calibri" w:hAnsi="Calibri"/>
+                <w:b w:val="0"/>
+                <w:sz w:val="20"/>
+              </w:rPr>
+              <w:t>93.6%</w:t>
+            </w:r>
+          </w:p>
+        </w:tc>
+        <w:tc>
+          <w:tcPr>
+            <w:tcW w:type="dxa" w:w="1824"/>
+          </w:tcPr>
+          <w:p>
+            <w:pPr>
+              <w:jc w:val="center"/>
+            </w:pPr>
+            <w:r>
+              <w:rPr>
+                <w:rFonts w:ascii="Calibri" w:hAnsi="Calibri"/>
+                <w:b w:val="0"/>
+                <w:sz w:val="20"/>
+              </w:rPr>
+              <w:t>−0.021</w:t>
+            </w:r>
+          </w:p>
+        </w:tc>
+        <w:tc>
+          <w:tcPr>
+            <w:tcW w:type="dxa" w:w="1824"/>
+          </w:tcPr>
+          <w:p>
+            <w:pPr>
+              <w:jc w:val="center"/>
+            </w:pPr>
+            <w:r>
+              <w:rPr>
+                <w:rFonts w:ascii="Calibri" w:hAnsi="Calibri"/>
+                <w:b w:val="0"/>
+                <w:sz w:val="20"/>
+              </w:rPr>
+            </w:r>
+          </w:p>
+        </w:tc>
+      </w:tr>
+      <w:tr>
+        <w:tc>
+          <w:tcPr>
+            <w:tcW w:type="dxa" w:w="1824"/>
+          </w:tcPr>
+          <w:p>
+            <w:r>
+              <w:t>rain_mm_day</w:t>
+            </w:r>
+          </w:p>
+        </w:tc>
+        <w:tc>
+          <w:tcPr>
+            <w:tcW w:type="dxa" w:w="1824"/>
+          </w:tcPr>
+          <w:p>
+            <w:r>
+              <w:t>Lluvia CHIRPS</w:t>
+            </w:r>
+          </w:p>
+        </w:tc>
+        <w:tc>
+          <w:tcPr>
+            <w:tcW w:type="dxa" w:w="1824"/>
+          </w:tcPr>
+          <w:p>
+            <w:r>
+              <w:t>96.4%</w:t>
+            </w:r>
+          </w:p>
+        </w:tc>
+        <w:tc>
+          <w:tcPr>
+            <w:tcW w:type="dxa" w:w="1824"/>
+          </w:tcPr>
+          <w:p>
+            <w:r>
+              <w:t>−0.030</w:t>
+            </w:r>
+          </w:p>
+        </w:tc>
+        <w:tc>
+          <w:tcPr>
+            <w:tcW w:type="dxa" w:w="1824"/>
+          </w:tcPr>
+          <w:p>
+            <w:r>
+              <w:t>Proxy criaderos (ciclo larvario)</w:t>
+            </w:r>
+          </w:p>
+        </w:tc>
+      </w:tr>
+      <w:tr>
+        <w:tc>
+          <w:tcPr>
+            <w:tcW w:type="dxa" w:w="1824"/>
+          </w:tcPr>
+          <w:p>
+            <w:r>
+              <w:t>rain_lag_1</w:t>
+            </w:r>
+          </w:p>
+        </w:tc>
+        <w:tc>
+          <w:tcPr>
+            <w:tcW w:type="dxa" w:w="1824"/>
+          </w:tcPr>
+          <w:p>
+            <w:r>
+              <w:t>Lluvia CHIRPS</w:t>
+            </w:r>
+          </w:p>
+        </w:tc>
+        <w:tc>
+          <w:tcPr>
+            <w:tcW w:type="dxa" w:w="1824"/>
+          </w:tcPr>
+          <w:p>
+            <w:r>
+              <w:t>95.4%</w:t>
+            </w:r>
+          </w:p>
+        </w:tc>
+        <w:tc>
+          <w:tcPr>
+            <w:tcW w:type="dxa" w:w="1824"/>
+          </w:tcPr>
+          <w:p>
+            <w:r>
+              <w:t>−0.031</w:t>
+            </w:r>
+          </w:p>
+        </w:tc>
+        <w:tc>
+          <w:tcPr>
+            <w:tcW w:type="dxa" w:w="1824"/>
+          </w:tcPr>
+          <w:p>
+            <w:r/>
+          </w:p>
+        </w:tc>
+      </w:tr>
+      <w:tr>
+        <w:tc>
+          <w:tcPr>
+            <w:tcW w:type="dxa" w:w="1824"/>
+          </w:tcPr>
+          <w:p>
+            <w:r>
+              <w:t>rain_lag_2</w:t>
+            </w:r>
+          </w:p>
+        </w:tc>
+        <w:tc>
+          <w:tcPr>
+            <w:tcW w:type="dxa" w:w="1824"/>
+          </w:tcPr>
+          <w:p>
+            <w:r>
+              <w:t>Lluvia CHIRPS</w:t>
+            </w:r>
+          </w:p>
+        </w:tc>
+        <w:tc>
+          <w:tcPr>
+            <w:tcW w:type="dxa" w:w="1824"/>
+          </w:tcPr>
+          <w:p>
+            <w:r>
+              <w:t>94.5%</w:t>
+            </w:r>
+          </w:p>
+        </w:tc>
+        <w:tc>
+          <w:tcPr>
+            <w:tcW w:type="dxa" w:w="1824"/>
+          </w:tcPr>
+          <w:p>
+            <w:r>
+              <w:t>−0.033</w:t>
+            </w:r>
+          </w:p>
+        </w:tc>
+        <w:tc>
+          <w:tcPr>
+            <w:tcW w:type="dxa" w:w="1824"/>
+          </w:tcPr>
+          <w:p>
+            <w:r/>
+          </w:p>
+        </w:tc>
+      </w:tr>
+      <w:tr>
+        <w:tc>
+          <w:tcPr>
+            <w:tcW w:type="dxa" w:w="1824"/>
+          </w:tcPr>
+          <w:p>
+            <w:r>
+              <w:t>rain_lag_3</w:t>
+            </w:r>
+          </w:p>
+        </w:tc>
+        <w:tc>
+          <w:tcPr>
+            <w:tcW w:type="dxa" w:w="1824"/>
+          </w:tcPr>
+          <w:p>
+            <w:r>
+              <w:t>Lluvia CHIRPS</w:t>
+            </w:r>
+          </w:p>
+        </w:tc>
+        <w:tc>
+          <w:tcPr>
+            <w:tcW w:type="dxa" w:w="1824"/>
+          </w:tcPr>
+          <w:p>
+            <w:r>
+              <w:t>93.6%</w:t>
+            </w:r>
+          </w:p>
+        </w:tc>
+        <w:tc>
+          <w:tcPr>
+            <w:tcW w:type="dxa" w:w="1824"/>
+          </w:tcPr>
+          <w:p>
+            <w:r>
+              <w:t>−0.037</w:t>
+            </w:r>
+          </w:p>
+        </w:tc>
+        <w:tc>
+          <w:tcPr>
+            <w:tcW w:type="dxa" w:w="1824"/>
+          </w:tcPr>
+          <w:p>
+            <w:r/>
           </w:p>
         </w:tc>
       </w:tr>
@@ -2917,7 +3121,7 @@
           <w:b w:val="0"/>
           <w:sz w:val="22"/>
         </w:rPr>
-        <w:t>Constituyen el grupo más predictivo. La suma móvil de 3 meses (grave_roll3) supera a cualquier rezago individual, capturando el efecto acumulado de la carga epidémica reciente. Los rezagos de 1 a 4 meses presentan correlaciones entre 0.218 y 0.282, coherentes con el período de incubación del dengue y el tiempo de diagnóstico en el sistema SIVIGILA. El rezago de 6 meses (r = 0.721) refleja la persistencia epidémica a mediano plazo característica del dengue en Colombia.</w:t>
+        <w:t>Constituyen el grupo más predictivo con mucha diferencia. El rezago de un mes (grave_lag_1, r = 0.921) es el predictor más potente del dataset, seguido de grave_roll3 (r = 0.903), grave_lag_2 (r = 0.888), grave_lag_3 (r = 0.844), grave_lag_4 (r = 0.796) y grave_lag_6 (r = 0.721). Las correlaciones mensuales son sustancialmente más altas que en granularidad semanal porque los totales mensuales tienen mayor persistencia temporal. La suma móvil de 3 meses (grave_roll3) captura la carga acumulada reciente y prácticamente empata con el mejor rezago individual.</w:t>
       </w:r>
     </w:p>
     <w:p>
@@ -2945,7 +3149,7 @@
           <w:b w:val="0"/>
           <w:sz w:val="22"/>
         </w:rPr>
-        <w:t>El dengue clásico actúa como precursor del dengue grave: los brotes de casos clásicos suelen preceder en 1 a 4 meses el incremento de casos graves. La correlación decrece con el rezago (r = 0.093 a r = 0.142), sugiriendo que el período de mayor relevancia predictiva es de 2 a 3 semanas. La suma móvil clasico_roll3 (r = 0.191) es el mejor predictor dentro de este grupo.</w:t>
+        <w:t>El dengue clásico actúa como precursor del dengue grave: los brotes de casos clásicos suelen preceder en 1 a 4 meses el incremento de casos graves. Las correlaciones mensuales son: clasico_lag_1 (r = 0.371), clasico_roll3 (r = 0.352), clasico_lag_2 (r = 0.349), clasico_lag_3 (r = 0.327), clasico_lag_4 (r = 0.305) y clasico_lag_6 (r = 0.272). El patrón decreciente con el rezago confirma que el período de mayor relevancia predictiva es el mes anterior.</w:t>
       </w:r>
     </w:p>
     <w:p>
@@ -2973,7 +3177,7 @@
           <w:b w:val="0"/>
           <w:sz w:val="22"/>
         </w:rPr>
-        <w:t>La temperatura (ERA5-Land, temp_mean_c, r ≈ 0.05) y la lluvia (CHIRPS, rain_mm_day, r ≈ 0.08) presentan correlaciones lineales moderadas con la variable objetivo. La relación entre temperatura y dengue es no lineal (rango óptimo de 26–32 °C para la proliferación del vector Aedes aegypti). La lluvia actúa como proxy de criaderos disponibles para el mosquito. Ambas variables incluyen rezagos t-1, t-2, t-3 que capturan el ciclo larvario (~10–14 días). La cobertura es 96.4% (rango temperatura 8.9–33.0 °C; lluvia 0.0–46.1 mm/día); XGBoost maneja los nulos restantes nativamente. (r ≈ 0.013–0.015), lo cual no implica que la variable sea irrelevante. La relación entre temperatura y dengue es no lineal (existe un rango óptimo de 26–32 °C para la proliferación del vector Aedes aegypti, con descenso fuera de ese rango). Un modelo basado en árboles como XGBoost captura estas relaciones sin necesidad de transformación explícita. La cobertura del 83.5% es aceptable; el 16.4% de nulos se origina en nubosidad (comportamiento normal de MODIS) y es manejado nativamente por XGBoost sin imputación obligatoria.</w:t>
+        <w:t>La temperatura (ERA5-Land, temp_mean_c) y la lluvia (CHIRPS, rain_mm_day) presentan correlaciones lineales levemente negativas (temp: r ≈ −0.022; lluvia: r ≈ −0.030 a −0.037 con rezago creciente). Esto refleja un efecto de composición: la mayoría de municipios con alta temperatura/lluvia son rurales de baja endemia y dominan la correlación marginal. Sin embargo, la relación entre clima y dengue es no lineal (rango óptimo de 26–32 °C para Aedes aegypti; la lluvia crea criaderos con un ciclo larvario de ~10–14 días). XGBoost captura estas interacciones sin transformación explícita. Cobertura: 96.4% (temperatura 8.9–33.0 °C; lluvia 0.0–46.1 mm/día); nulos manejados nativamente. Se incluyen rezagos t-1, t-2, t-3 para ambas variables.</w:t>
       </w:r>
     </w:p>
     <w:p>
@@ -3001,7 +3205,7 @@
           <w:b w:val="0"/>
           <w:sz w:val="22"/>
         </w:rPr>
-        <w:t>El percentil 75 histórico por semana calendario (p75, r = 0.228) es el umbral de alarma epidémica (metodología Bortman 1999) y tiene alta correlación con la variable objetivo, lo que refleja que los municipios con mayor carga histórica tienden a mantener altos niveles de actividad. La zona del canal calculada sobre el rezago de 1 semana (zona_canal_lag1, r = −0.101) complementa la información al codificar el estado epidémico reciente (0 = normal, 1 = alerta, 2 = exceso).</w:t>
+        <w:t>El percentil 75 histórico por mes calendario (p75, r = 0.456) es el umbral de alarma epidémica (metodología Bortman 1999) y es el predictor no-lag más fuerte del dataset. Le sigue p25 (r = 0.322), que captura el umbral inferior del canal. La zona del canal calculada sobre el rezago de 1 mes (zona_canal_lag1, r = 0.237) codifica el estado epidémico reciente: 0 = normal, 1 = alerta, 2 = exceso. Con datos mensuales el 6.1% de observaciones están en zona de exceso (vs. el ~87% antes de aplicar la corrección P75=0). La endemicidad (es_endemico, r = 0.176) distingue municipios con actividad histórica sostenida (139 de 1,182). El SIR (sir_lag1, r = 0.095) tiene cobertura del 63.6% y complementa el canal con una perspectiva relativa.</w:t>
       </w:r>
     </w:p>
     <w:p>
@@ -3029,7 +3233,7 @@
           <w:b w:val="0"/>
           <w:sz w:val="22"/>
         </w:rPr>
-        <w:t>El año (ANO) captura la tendencia temporal a largo plazo de los casos graves en Colombia. La estacionalidad mensual codificada mediante funciones seno/coseno (mes_sin, mes_cos) permite capturar patrones cíclicos sin discontinuidad diciembre→enero. La variable anio_epidemia (= ANO − 2007) provee una tendencia continua desde el inicio de la serie. XGBoost captura las interacciones entre estas features temporales y los rezagos de casos. a largo plazo de los casos graves en Colombia, posiblemente asociada a mejoras en la vigilancia, vacunación y control vectorial. La estacionalidad mensual codificada mediante funciones seno/coseno (mes_sin, mes_cos) presenta correlación lineal baja, aunque su efecto puede ser relevante en combinación con otras features dentro del árbol. El indicador de año epidémico (anio_epidemia: 2010, 2016, 2019, 2023) tiene correlación prácticamente nula en forma aislada.</w:t>
+        <w:t>El año (ANO) y anio_epidemia presentan correlación negativa (r = −0.100), reflejando la tendencia decreciente a largo plazo de los casos graves en Colombia, posiblemente asociada a mejoras en vigilancia, vacunación y control vectorial. La estacionalidad mensual codificada con mes_sin/mes_cos tiene correlación lineal casi nula (r ≈ ±0.005), pero su interacción con rezagos y canal endémico es capturada por XGBoost. MES (r = −0.006) y anio_epidemia (= ANO − 2007) proveen contexto temporal continuo sin necesidad de indicadores de año epidémico binarios.</w:t>
       </w:r>
     </w:p>
     <w:p>
@@ -3057,7 +3261,7 @@
           <w:b w:val="0"/>
           <w:sz w:val="22"/>
         </w:rPr>
-        <w:t>Tras eliminar filas sin al menos los dos rezagos más recientes (grave_lag_1 y grave_lag_2), el dataset final cuenta con 111,795 observaciones y 29 columnas (5 identificadores + variable objetivo + 30 features). Los nulos restantes, concentrados principalmente en las features de temperatura, son manejados nativamente por XGBoost.</w:t>
+        <w:t>El dataset final cuenta con 111,795 observaciones y 34 columnas (3 identificadores + variable objetivo + 30 features). Período 2007–2025, 1,182 municipios. Los nulos restantes, concentrados en features climáticas con rezago largo (sir_lag1: 36.4%; temp/rain_lag_3: 6.4%), son manejados nativamente por XGBoost sin imputación.</w:t>
       </w:r>
     </w:p>
     <w:tbl>
@@ -3181,7 +3385,7 @@
                 <w:b w:val="0"/>
                 <w:sz w:val="20"/>
               </w:rPr>
-              <w:t>30</w:t>
+              <w:t>34</w:t>
             </w:r>
           </w:p>
         </w:tc>
@@ -3219,7 +3423,7 @@
                 <w:b w:val="0"/>
                 <w:sz w:val="20"/>
               </w:rPr>
-              <w:t>554</w:t>
+              <w:t>1,182</w:t>
             </w:r>
           </w:p>
         </w:tc>
@@ -3257,7 +3461,7 @@
                 <w:b w:val="0"/>
                 <w:sz w:val="20"/>
               </w:rPr>
-              <w:t>2007 – 2024</w:t>
+              <w:t>2007 – 2025</w:t>
             </w:r>
           </w:p>
         </w:tc>
@@ -3295,7 +3499,7 @@
                 <w:b w:val="0"/>
                 <w:sz w:val="20"/>
               </w:rPr>
-              <w:t>lst_media, lst_lag_1, lst_lag_2, lst_lag_4 (≈ 16–17%)</w:t>
+              <w:t>sir_lag1 (36.4%)</w:t>
             </w:r>
           </w:p>
         </w:tc>
@@ -3333,7 +3537,7 @@
                 <w:b w:val="0"/>
                 <w:sz w:val="20"/>
               </w:rPr>
-              <w:t>grave_lag_8, clasico_lag_8, grave_lag_4, clasico_lag_4, zona_canal_lag1, p25, p75</w:t>
+              <w:t>grave_roll3, clasico_roll3 (0%), grave_lag_1, clasico_lag_1 (1.1%)</w:t>
             </w:r>
           </w:p>
         </w:tc>
@@ -3547,7 +3751,7 @@
                 <w:b w:val="0"/>
                 <w:sz w:val="20"/>
               </w:rPr>
-              <w:t>190,934</w:t>
+              <w:t>83,138</w:t>
             </w:r>
           </w:p>
         </w:tc>
@@ -3565,7 +3769,7 @@
                 <w:b w:val="0"/>
                 <w:sz w:val="20"/>
               </w:rPr>
-              <w:t>20,352 (10.7%)</w:t>
+              <w:t>13,833 (16.6%)</w:t>
             </w:r>
           </w:p>
         </w:tc>
@@ -3621,7 +3825,7 @@
                 <w:b w:val="0"/>
                 <w:sz w:val="20"/>
               </w:rPr>
-              <w:t xml:space="preserve"> 12,625</w:t>
+              <w:t>5,308</w:t>
             </w:r>
           </w:p>
         </w:tc>
@@ -3639,7 +3843,7 @@
                 <w:b w:val="0"/>
                 <w:sz w:val="20"/>
               </w:rPr>
-              <w:t xml:space="preserve">   980  (7.8%)</w:t>
+              <w:t>717 (13.5%)</w:t>
             </w:r>
           </w:p>
         </w:tc>
@@ -3677,7 +3881,7 @@
                 <w:b w:val="0"/>
                 <w:sz w:val="20"/>
               </w:rPr>
-              <w:t>2023 – 2024</w:t>
+              <w:t>2023 – 2025</w:t>
             </w:r>
           </w:p>
         </w:tc>
@@ -3695,7 +3899,7 @@
                 <w:b w:val="0"/>
                 <w:sz w:val="20"/>
               </w:rPr>
-              <w:t xml:space="preserve"> 44,207</w:t>
+              <w:t>23,349</w:t>
             </w:r>
           </w:p>
         </w:tc>
@@ -3713,7 +3917,7 @@
                 <w:b w:val="0"/>
                 <w:sz w:val="20"/>
               </w:rPr>
-              <w:t xml:space="preserve"> 3,288  (7.4%)</w:t>
+              <w:t>3,164 (13.6%)</w:t>
             </w:r>
           </w:p>
         </w:tc>
@@ -3760,7 +3964,7 @@
           <w:b/>
           <w:sz w:val="22"/>
         </w:rPr>
-        <w:t>Rezagos propios como señal dominante.</w:t>
+        <w:t>Rezagos propios como señal dominante. Los rezagos propios de dengue grave dominan el dataset: grave_lag_1 (r = 0.921) y grave_roll3 (r = 0.903)</w:t>
       </w:r>
       <w:r>
         <w:rPr>
@@ -3768,7 +3972,6 @@
           <w:b w:val="0"/>
           <w:sz w:val="22"/>
         </w:rPr>
-        <w:t xml:space="preserve"> Los rezagos propios de dengue grave, especialmente la suma móvil de 3 meses (grave_roll3), son los predictores más potentes e indispensables para el modelo.</w:t>
       </w:r>
     </w:p>
     <w:p>
@@ -3783,7 +3986,7 @@
           <w:b/>
           <w:sz w:val="22"/>
         </w:rPr>
-        <w:t>Clásico como precursor epidémico.</w:t>
+        <w:t>Clásico como precursor epidémico. Los rezagos de dengue clásico aportan información complementaria sobre el estado epidémico local, reflejando la progresión clínica de clásico a grave con un desfase de 1–3 meses (clasico_lag_1, r = 0.371).</w:t>
       </w:r>
       <w:r>
         <w:rPr>
@@ -3791,7 +3994,6 @@
           <w:b w:val="0"/>
           <w:sz w:val="22"/>
         </w:rPr>
-        <w:t xml:space="preserve"> Los rezagos de dengue clásico aportan información complementaria sobre el estado epidémico local, reflejando la progresión clínica de clásico a grave con un desfase de 1–3 semanas.</w:t>
       </w:r>
     </w:p>
     <w:p>
@@ -3806,7 +4008,7 @@
           <w:b/>
           <w:sz w:val="22"/>
         </w:rPr>
-        <w:t>Temperatura LST como feature de contexto climático.</w:t>
+        <w:t>Temperatura y lluvia ERA5/CHIRPS como features de contexto climático. Aunque la correlación lineal de temperatura (r ≈ −0.022) y lluvia (r ≈ −0.030) es baja o negativa en términos marginales, su relación con la abundancia vectorial es no lineal; XGBoost las explotará en combinación con rezagos y canal endémico. Cobertura 96.4% con nulos manejables de forma nativa.</w:t>
       </w:r>
       <w:r>
         <w:rPr>
@@ -3814,7 +4016,6 @@
           <w:b w:val="0"/>
           <w:sz w:val="22"/>
         </w:rPr>
-        <w:t xml:space="preserve"> La temperatura LST tiene baja correlación lineal pero su relación con la abundancia vectorial es no lineal; XGBoost la explotará sin necesidad de transformaciones adicionales. Su 16% de nulos por nubosidad es aceptable y manejable de forma nativa.</w:t>
       </w:r>
     </w:p>
     <w:p>
@@ -3829,7 +4030,7 @@
           <w:b/>
           <w:sz w:val="22"/>
         </w:rPr>
-        <w:t>Canal endémico como memoria histórica del municipio.</w:t>
+        <w:t>Canal endémico como memoria histórica del municipio. El percentil 75 histórico (p75, r = 0.456) es el predictor no-lag más fuerte del dataset: sintetiza la carga histórica de cada municipio y el umbral de alarma epidémica (metodología Bortman 1999).</w:t>
       </w:r>
       <w:r>
         <w:rPr>
@@ -3837,7 +4038,6 @@
           <w:b w:val="0"/>
           <w:sz w:val="22"/>
         </w:rPr>
-        <w:t xml:space="preserve"> El percentil 75 histórico (p75) del canal endémico es un resumen efectivo de la carga histórica municipal y presenta correlación notable (r = 0.228).</w:t>
       </w:r>
     </w:p>
     <w:p>
@@ -4484,7 +4684,7 @@
                 <w:b w:val="0"/>
                 <w:sz w:val="20"/>
               </w:rPr>
-              <w:t>Temperatura GEE cruda</w:t>
+              <w:t>Temperatura MODIS LST</w:t>
             </w:r>
           </w:p>
         </w:tc>
@@ -4502,7 +4702,7 @@
                 <w:b w:val="0"/>
                 <w:sz w:val="20"/>
               </w:rPr>
-              <w:t>lst_celsius diario (sin agregar)</w:t>
+              <w:t>gee_lst_municipios.csv, lst_celsius</w:t>
             </w:r>
           </w:p>
         </w:tc>
@@ -4520,7 +4720,7 @@
                 <w:b w:val="0"/>
                 <w:sz w:val="20"/>
               </w:rPr>
-              <w:t>Se agrega a nivel semanal antes de usar</w:t>
+              <w:t>Reemplazado por ERA5-Land (temp_mean_c) y CHIRPS (rain_mm_day) via gee_environment_mensual.csv</w:t>
             </w:r>
           </w:p>
         </w:tc>
@@ -4658,7 +4858,7 @@
                 <w:b w:val="0"/>
                 <w:sz w:val="20"/>
               </w:rPr>
-              <w:t>grave_lag_1, _2, _3, _4, _8</w:t>
+              <w:t>grave_lag_1, _2, _3, _4, _6</w:t>
             </w:r>
           </w:p>
         </w:tc>
@@ -4676,7 +4876,7 @@
                 <w:b w:val="0"/>
                 <w:sz w:val="20"/>
               </w:rPr>
-              <w:t>Shift por municipio sobre serie semanal de casos graves</w:t>
+              <w:t>Shift por DIVIPOLA sobre serie mensual de casos graves. Lags 1–6 meses.</w:t>
             </w:r>
           </w:p>
         </w:tc>
@@ -4732,7 +4932,7 @@
                 <w:b w:val="0"/>
                 <w:sz w:val="20"/>
               </w:rPr>
-              <w:t>Suma de los 4 rezagos anteriores (carga acumulada mes)</w:t>
+              <w:t>Suma de los 3 rezagos previos de grave (carga acumulada trimestral).</w:t>
             </w:r>
           </w:p>
         </w:tc>
@@ -4770,7 +4970,7 @@
                 <w:b w:val="0"/>
                 <w:sz w:val="20"/>
               </w:rPr>
-              <w:t>clasico_lag_1, _2, _3, _4, _8</w:t>
+              <w:t>clasico_lag_1, _2, _3, _4, _6</w:t>
             </w:r>
           </w:p>
         </w:tc>
@@ -4788,7 +4988,7 @@
                 <w:b w:val="0"/>
                 <w:sz w:val="20"/>
               </w:rPr>
-              <w:t>Idem sobre serie de clásico (precursor)</w:t>
+              <w:t>Idem sobre serie de clásico (precursor epidémico). Lags 1–6 meses.</w:t>
             </w:r>
           </w:p>
         </w:tc>
@@ -4844,7 +5044,7 @@
                 <w:b w:val="0"/>
                 <w:sz w:val="20"/>
               </w:rPr>
-              <w:t>Suma de los 4 rezagos anteriores de clásico</w:t>
+              <w:t>Suma de los 3 rezagos previos de clásico.</w:t>
             </w:r>
           </w:p>
         </w:tc>
@@ -4864,7 +5064,7 @@
                 <w:b w:val="0"/>
                 <w:sz w:val="20"/>
               </w:rPr>
-              <w:t>Temperatura semanal</w:t>
+              <w:t>Temperatura mensual</w:t>
             </w:r>
           </w:p>
         </w:tc>
@@ -4882,7 +5082,7 @@
                 <w:b w:val="0"/>
                 <w:sz w:val="20"/>
               </w:rPr>
-              <w:t>lst_media</w:t>
+              <w:t>temp_mean_c</w:t>
             </w:r>
           </w:p>
         </w:tc>
@@ -4900,7 +5100,7 @@
                 <w:b w:val="0"/>
                 <w:sz w:val="20"/>
               </w:rPr>
-              <w:t>Media semanal de LST diario por municipio (GEE/MODIS)</w:t>
+              <w:t>Media mensual de temperatura ERA5-Land 2m por DIVIPOLA.</w:t>
             </w:r>
           </w:p>
         </w:tc>
@@ -4938,7 +5138,7 @@
                 <w:b w:val="0"/>
                 <w:sz w:val="20"/>
               </w:rPr>
-              <w:t>lst_lag_1, lst_lag_2, lst_lag_4</w:t>
+              <w:t>temp_lag_1, temp_lag_2, temp_lag_3</w:t>
             </w:r>
           </w:p>
         </w:tc>
@@ -4956,7 +5156,119 @@
                 <w:b w:val="0"/>
                 <w:sz w:val="20"/>
               </w:rPr>
-              <w:t>LST de semanas anteriores (ciclo de vida del vector)</w:t>
+              <w:t>Temperatura de meses anteriores (ciclo de vida del vector).</w:t>
+            </w:r>
+          </w:p>
+        </w:tc>
+      </w:tr>
+      <w:tr>
+        <w:tc>
+          <w:tcPr>
+            <w:tcW w:type="dxa" w:w="3041"/>
+          </w:tcPr>
+          <w:p>
+            <w:pPr>
+              <w:jc w:val="left"/>
+            </w:pPr>
+            <w:r>
+              <w:rPr>
+                <w:rFonts w:ascii="Calibri" w:hAnsi="Calibri"/>
+                <w:b w:val="0"/>
+                <w:sz w:val="20"/>
+              </w:rPr>
+              <w:t>Lluvia mensual</w:t>
+            </w:r>
+          </w:p>
+        </w:tc>
+        <w:tc>
+          <w:tcPr>
+            <w:tcW w:type="dxa" w:w="3041"/>
+          </w:tcPr>
+          <w:p>
+            <w:pPr>
+              <w:jc w:val="center"/>
+            </w:pPr>
+            <w:r>
+              <w:rPr>
+                <w:rFonts w:ascii="Calibri" w:hAnsi="Calibri"/>
+                <w:b w:val="0"/>
+                <w:sz w:val="20"/>
+              </w:rPr>
+              <w:t>rain_mm_day</w:t>
+            </w:r>
+          </w:p>
+        </w:tc>
+        <w:tc>
+          <w:tcPr>
+            <w:tcW w:type="dxa" w:w="3041"/>
+          </w:tcPr>
+          <w:p>
+            <w:pPr>
+              <w:jc w:val="center"/>
+            </w:pPr>
+            <w:r>
+              <w:rPr>
+                <w:rFonts w:ascii="Calibri" w:hAnsi="Calibri"/>
+                <w:b w:val="0"/>
+                <w:sz w:val="20"/>
+              </w:rPr>
+              <w:t>Media mensual de precipitación CHIRPS (mm/día) por DIVIPOLA.</w:t>
+            </w:r>
+          </w:p>
+        </w:tc>
+      </w:tr>
+      <w:tr>
+        <w:tc>
+          <w:tcPr>
+            <w:tcW w:type="dxa" w:w="3041"/>
+          </w:tcPr>
+          <w:p>
+            <w:pPr>
+              <w:jc w:val="left"/>
+            </w:pPr>
+            <w:r>
+              <w:rPr>
+                <w:rFonts w:ascii="Calibri" w:hAnsi="Calibri"/>
+                <w:b w:val="0"/>
+                <w:sz w:val="20"/>
+              </w:rPr>
+              <w:t>Rezagos de lluvia</w:t>
+            </w:r>
+          </w:p>
+        </w:tc>
+        <w:tc>
+          <w:tcPr>
+            <w:tcW w:type="dxa" w:w="3041"/>
+          </w:tcPr>
+          <w:p>
+            <w:pPr>
+              <w:jc w:val="center"/>
+            </w:pPr>
+            <w:r>
+              <w:rPr>
+                <w:rFonts w:ascii="Calibri" w:hAnsi="Calibri"/>
+                <w:b w:val="0"/>
+                <w:sz w:val="20"/>
+              </w:rPr>
+              <w:t>rain_lag_1, rain_lag_2, rain_lag_3</w:t>
+            </w:r>
+          </w:p>
+        </w:tc>
+        <w:tc>
+          <w:tcPr>
+            <w:tcW w:type="dxa" w:w="3041"/>
+          </w:tcPr>
+          <w:p>
+            <w:pPr>
+              <w:jc w:val="center"/>
+            </w:pPr>
+            <w:r>
+              <w:rPr>
+                <w:rFonts w:ascii="Calibri" w:hAnsi="Calibri"/>
+                <w:b w:val="0"/>
+                <w:sz w:val="20"/>
+              </w:rPr>
+              <w:t>Lluvia de meses anteriores (proxy de criaderos con rezago).</w:t>
             </w:r>
           </w:p>
         </w:tc>
@@ -5012,7 +5324,7 @@
                 <w:b w:val="0"/>
                 <w:sz w:val="20"/>
               </w:rPr>
-              <w:t>sin/cos(2π × semana/52): codificación continua del año</w:t>
+              <w:t>sin/cos(2π × MES/12): codificación continua del mes sin discontinuidad dic→ene.</w:t>
             </w:r>
           </w:p>
         </w:tc>
@@ -5032,7 +5344,7 @@
                 <w:b w:val="0"/>
                 <w:sz w:val="20"/>
               </w:rPr>
-              <w:t>Año epidémico</w:t>
+              <w:t>Tendencia temporal</w:t>
             </w:r>
           </w:p>
         </w:tc>
@@ -5050,7 +5362,7 @@
                 <w:b w:val="0"/>
                 <w:sz w:val="20"/>
               </w:rPr>
-              <w:t>anio_epidemia</w:t>
+              <w:t>ANO, MES, anio_epidemia</w:t>
             </w:r>
           </w:p>
         </w:tc>
@@ -5068,7 +5380,7 @@
                 <w:b w:val="0"/>
                 <w:sz w:val="20"/>
               </w:rPr>
-              <w:t>Binario: 1 si el año es 2010, 2016, 2019 o 2023</w:t>
+              <w:t>Año, mes, y tendencia continua desde 2007 (anio_epidemia = ANO − 2007).</w:t>
             </w:r>
           </w:p>
         </w:tc>
@@ -5124,7 +5436,7 @@
                 <w:b w:val="0"/>
                 <w:sz w:val="20"/>
               </w:rPr>
-              <w:t>Binario: municipio cumple criterio D4 (&gt;=10 años, &gt;=200 casos)</w:t>
+              <w:t>Binario: municipio con ≥3 meses con casos Y ≥50 casos totales hist.</w:t>
             </w:r>
           </w:p>
         </w:tc>
@@ -5180,119 +5492,7 @@
                 <w:b w:val="0"/>
                 <w:sz w:val="20"/>
               </w:rPr>
-              <w:t>Percentiles históricos de grave por municipio y semana (ref 2007-2022)</w:t>
-            </w:r>
-          </w:p>
-        </w:tc>
-      </w:tr>
-      <w:tr>
-        <w:tc>
-          <w:tcPr>
-            <w:tcW w:type="dxa" w:w="3041"/>
-          </w:tcPr>
-          <w:p>
-            <w:pPr>
-              <w:jc w:val="left"/>
-            </w:pPr>
-            <w:r>
-              <w:rPr>
-                <w:rFonts w:ascii="Calibri" w:hAnsi="Calibri"/>
-                <w:b w:val="0"/>
-                <w:sz w:val="20"/>
-              </w:rPr>
-              <w:t>Zona canal</w:t>
-            </w:r>
-          </w:p>
-        </w:tc>
-        <w:tc>
-          <w:tcPr>
-            <w:tcW w:type="dxa" w:w="3041"/>
-          </w:tcPr>
-          <w:p>
-            <w:pPr>
-              <w:jc w:val="center"/>
-            </w:pPr>
-            <w:r>
-              <w:rPr>
-                <w:rFonts w:ascii="Calibri" w:hAnsi="Calibri"/>
-                <w:b w:val="0"/>
-                <w:sz w:val="20"/>
-              </w:rPr>
-              <w:t>zona_canal_lag1</w:t>
-            </w:r>
-          </w:p>
-        </w:tc>
-        <w:tc>
-          <w:tcPr>
-            <w:tcW w:type="dxa" w:w="3041"/>
-          </w:tcPr>
-          <w:p>
-            <w:pPr>
-              <w:jc w:val="center"/>
-            </w:pPr>
-            <w:r>
-              <w:rPr>
-                <w:rFonts w:ascii="Calibri" w:hAnsi="Calibri"/>
-                <w:b w:val="0"/>
-                <w:sz w:val="20"/>
-              </w:rPr>
-              <w:t>0=normal, 1=alerta, 2=exceso según p25/p75 de la semana anterior</w:t>
-            </w:r>
-          </w:p>
-        </w:tc>
-      </w:tr>
-      <w:tr>
-        <w:tc>
-          <w:tcPr>
-            <w:tcW w:type="dxa" w:w="3041"/>
-          </w:tcPr>
-          <w:p>
-            <w:pPr>
-              <w:jc w:val="left"/>
-            </w:pPr>
-            <w:r>
-              <w:rPr>
-                <w:rFonts w:ascii="Calibri" w:hAnsi="Calibri"/>
-                <w:b w:val="0"/>
-                <w:sz w:val="20"/>
-              </w:rPr>
-              <w:t>SIR</w:t>
-            </w:r>
-          </w:p>
-        </w:tc>
-        <w:tc>
-          <w:tcPr>
-            <w:tcW w:type="dxa" w:w="3041"/>
-          </w:tcPr>
-          <w:p>
-            <w:pPr>
-              <w:jc w:val="center"/>
-            </w:pPr>
-            <w:r>
-              <w:rPr>
-                <w:rFonts w:ascii="Calibri" w:hAnsi="Calibri"/>
-                <w:b w:val="0"/>
-                <w:sz w:val="20"/>
-              </w:rPr>
-              <w:t>sir_lag1</w:t>
-            </w:r>
-          </w:p>
-        </w:tc>
-        <w:tc>
-          <w:tcPr>
-            <w:tcW w:type="dxa" w:w="3041"/>
-          </w:tcPr>
-          <w:p>
-            <w:pPr>
-              <w:jc w:val="center"/>
-            </w:pPr>
-            <w:r>
-              <w:rPr>
-                <w:rFonts w:ascii="Calibri" w:hAnsi="Calibri"/>
-                <w:b w:val="0"/>
-                <w:sz w:val="20"/>
-              </w:rPr>
-              <w:t>grave_lag_1 / media_historica(grave) por municipio-semana (ref 2007-2022)</w:t>
+              <w:t>Percentiles históricos de grave por DIVIPOLA y MES (referencia 2007–2021).</w:t>
             </w:r>
           </w:p>
         </w:tc>
@@ -5412,6 +5612,62 @@
                 <w:b w:val="0"/>
                 <w:sz w:val="20"/>
               </w:rPr>
+              <w:t>divipola</w:t>
+            </w:r>
+          </w:p>
+        </w:tc>
+        <w:tc>
+          <w:tcPr>
+            <w:tcW w:type="dxa" w:w="3041"/>
+          </w:tcPr>
+          <w:p>
+            <w:pPr>
+              <w:jc w:val="center"/>
+            </w:pPr>
+            <w:r>
+              <w:rPr>
+                <w:rFonts w:ascii="Calibri" w:hAnsi="Calibri"/>
+                <w:b w:val="0"/>
+                <w:sz w:val="20"/>
+              </w:rPr>
+              <w:t>Identificador</w:t>
+            </w:r>
+          </w:p>
+        </w:tc>
+        <w:tc>
+          <w:tcPr>
+            <w:tcW w:type="dxa" w:w="3041"/>
+          </w:tcPr>
+          <w:p>
+            <w:pPr>
+              <w:jc w:val="center"/>
+            </w:pPr>
+            <w:r>
+              <w:rPr>
+                <w:rFonts w:ascii="Calibri" w:hAnsi="Calibri"/>
+                <w:b w:val="0"/>
+                <w:sz w:val="20"/>
+              </w:rPr>
+              <w:t>Código DIVIPOLA 5 dígitos (COD_DPTO + COD_MUN); llave única nacional.</w:t>
+            </w:r>
+          </w:p>
+        </w:tc>
+      </w:tr>
+      <w:tr>
+        <w:tc>
+          <w:tcPr>
+            <w:tcW w:type="dxa" w:w="3041"/>
+          </w:tcPr>
+          <w:p>
+            <w:pPr>
+              <w:jc w:val="left"/>
+            </w:pPr>
+            <w:r>
+              <w:rPr>
+                <w:rFonts w:ascii="Calibri" w:hAnsi="Calibri"/>
+                <w:b w:val="0"/>
+                <w:sz w:val="20"/>
+              </w:rPr>
               <w:t>COD_MUN_O</w:t>
             </w:r>
           </w:p>
@@ -5448,63 +5704,7 @@
                 <w:b w:val="0"/>
                 <w:sz w:val="20"/>
               </w:rPr>
-              <w:t>Código municipio SIVIGILA (3 dígitos); llave de agregación</w:t>
-            </w:r>
-          </w:p>
-        </w:tc>
-      </w:tr>
-      <w:tr>
-        <w:tc>
-          <w:tcPr>
-            <w:tcW w:type="dxa" w:w="3041"/>
-          </w:tcPr>
-          <w:p>
-            <w:pPr>
-              <w:jc w:val="left"/>
-            </w:pPr>
-            <w:r>
-              <w:rPr>
-                <w:rFonts w:ascii="Calibri" w:hAnsi="Calibri"/>
-                <w:b w:val="0"/>
-                <w:sz w:val="20"/>
-              </w:rPr>
-              <w:t>mun_key</w:t>
-            </w:r>
-          </w:p>
-        </w:tc>
-        <w:tc>
-          <w:tcPr>
-            <w:tcW w:type="dxa" w:w="3041"/>
-          </w:tcPr>
-          <w:p>
-            <w:pPr>
-              <w:jc w:val="center"/>
-            </w:pPr>
-            <w:r>
-              <w:rPr>
-                <w:rFonts w:ascii="Calibri" w:hAnsi="Calibri"/>
-                <w:b w:val="0"/>
-                <w:sz w:val="20"/>
-              </w:rPr>
-              <w:t>Identificador</w:t>
-            </w:r>
-          </w:p>
-        </w:tc>
-        <w:tc>
-          <w:tcPr>
-            <w:tcW w:type="dxa" w:w="3041"/>
-          </w:tcPr>
-          <w:p>
-            <w:pPr>
-              <w:jc w:val="center"/>
-            </w:pPr>
-            <w:r>
-              <w:rPr>
-                <w:rFonts w:ascii="Calibri" w:hAnsi="Calibri"/>
-                <w:b w:val="0"/>
-                <w:sz w:val="20"/>
-              </w:rPr>
-              <w:t>Nombre municipio normalizado; llave de join con GEE</w:t>
+              <w:t>Código municipio SIVIGILA (3 dígitos); solo para trazabilidad.</w:t>
             </w:r>
           </w:p>
         </w:tc>
@@ -5560,7 +5760,7 @@
                 <w:b w:val="0"/>
                 <w:sz w:val="20"/>
               </w:rPr>
-              <w:t>Departamento; útil para análisis geográfico</w:t>
+              <w:t>Departamento; útil para análisis geográfico.</w:t>
             </w:r>
           </w:p>
         </w:tc>
@@ -5598,7 +5798,7 @@
                 <w:b w:val="0"/>
                 <w:sz w:val="20"/>
               </w:rPr>
-              <w:t>Identificador</w:t>
+              <w:t>Identificador/Feature</w:t>
             </w:r>
           </w:p>
         </w:tc>
@@ -5616,7 +5816,7 @@
                 <w:b w:val="0"/>
                 <w:sz w:val="20"/>
               </w:rPr>
-              <w:t>Año epidemiológico</w:t>
+              <w:t>Año epidemiológico.</w:t>
             </w:r>
           </w:p>
         </w:tc>
@@ -5636,7 +5836,7 @@
                 <w:b w:val="0"/>
                 <w:sz w:val="20"/>
               </w:rPr>
-              <w:t>SEMANA</w:t>
+              <w:t>MES</w:t>
             </w:r>
           </w:p>
         </w:tc>
@@ -5654,7 +5854,7 @@
                 <w:b w:val="0"/>
                 <w:sz w:val="20"/>
               </w:rPr>
-              <w:t>Identificador</w:t>
+              <w:t>Identificador/Feature</w:t>
             </w:r>
           </w:p>
         </w:tc>
@@ -5672,7 +5872,7 @@
                 <w:b w:val="0"/>
                 <w:sz w:val="20"/>
               </w:rPr>
-              <w:t>Semana epidemiológica (1-53)</w:t>
+              <w:t>Mes epidemiológico (1–12).</w:t>
             </w:r>
           </w:p>
         </w:tc>
@@ -5728,7 +5928,7 @@
                 <w:b w:val="0"/>
                 <w:sz w:val="20"/>
               </w:rPr>
-              <w:t>Casos de dengue grave agregados por municipio y semana</w:t>
+              <w:t>Casos de dengue grave agregados por municipio y mes.</w:t>
             </w:r>
           </w:p>
         </w:tc>

</xml_diff>

<commit_message>
feat(entrega2): retrain models on objetivo target with ERA5+CHIRPS climate data
- Switch all models from brote to objetivo (brote at t+HORIZONTE) target
- Include 39 features: epidemic state, climate (ERA5+CHIRPS 96.3% coverage), seasonality
- XGBoost T+1: AUROC=0.900, AP=0.882, F1=0.792
- LightGBM T+1: AUROC=0.899, AP=0.880, F1=0.794
- GAM T+1: AUROC=0.869, AP=0.843, F1=0.777 (50K subsample for scalability)
- Fix MLflow log_model API change: name= -> artifact_path=
- Fix GAM features: zona_canal_lag1 -> zona_canal, sir_lag1 -> sir
- Update notebooks 09/10/11 with corrected pipeline design
- Regenerate Conclusiones_Feature_Analysis.docx and Reporte_Entrega2.docx
</commit_message>
<xml_diff>
--- a/Conclusiones_Feature_Analysis.docx
+++ b/Conclusiones_Feature_Analysis.docx
@@ -540,7 +540,7 @@
           <w:i w:val="0"/>
           <w:sz w:val="22"/>
         </w:rPr>
-        <w:t>El canal endémico aporta tres features derivadas del estado del mes anterior (t-1) para evitar data leakage. La variable zona_canal_lag1 clasifica el municipio en zona normal (0), alerta (1) o exceso (2) según si los casos del mes anterior estaban por debajo del P25, entre P25 y P75, o por encima del P75 del canal histórico. En el dataset completo, el 41.3% de los registros corresponde a zona normal, el 40.2% a alerta y el 18.5% a exceso.</w:t>
+        <w:t>El canal endémico aporta tres features del estado del mes actual (t). La variable zona_canal clasifica el municipio en zona normal (0), alerta (1) o exceso (2) según si los casos del mes actual están por debajo del P25, entre P25 y P75, o por encima del P75 del canal histórico. En el dataset completo, el 41.1% corresponde a zona normal, el 39.6% a alerta y el 19.4% a exceso. La variable zona_objetivo clasifica los casos actuales contra los umbrales del mes objetivo (t+1), señalando si el nivel actual de transmisión ya supera lo normal para el próximo mes.</w:t>
       </w:r>
     </w:p>
     <w:p>
@@ -554,7 +554,7 @@
           <w:i w:val="0"/>
           <w:sz w:val="22"/>
         </w:rPr>
-        <w:t>El índice SIR (Standardized Incidence Ratio) del mes anterior mide cuántas veces superan los casos actuales la media histórica del municipio y mes. Tiene una cobertura del 83.9% y una media de 1.77, con distribución muy sesgada hacia la derecha (percentil 75: 1.22, máximo: 1.808). La variable es_endemico indica si el municipio tiene historia epidémica previa y afecta a 523 de los 1.114 municipios. Ambas features presentan correlaciones con brote de 0.20 y 0.19 respectivamente.</w:t>
+        <w:t>El índice SIR (Standardized Incidence Ratio) mide cuántas veces superan los casos actuales la media histórica del municipio y mes. Tiene una cobertura del 84.3% y una media de 1.62, con distribución muy sesgada hacia la derecha. La variable es_endemico indica si el municipio tiene historia epidémica sostenida y afecta a 523 de los 1.114 municipios. Ambas features presentan alta correlación con el objetivo.</w:t>
       </w:r>
     </w:p>
     <w:p>
@@ -583,7 +583,7 @@
           <w:i w:val="0"/>
           <w:sz w:val="22"/>
         </w:rPr>
-        <w:t>El dataset incluye columnas reservadas para temperatura media (ERA5-Land) y precipitación media diaria (CHIRPS) con lags de 1 a 3 meses, obtenidas vía Google Earth Engine por DIVIPOLA. Sin embargo, en el conjunto de datos actual estas columnas presentan cobertura del 0%: la integración de la capa GEE al pipeline de construcción del panel está pendiente de resolución de permisos en el proyecto de GEE del grupo. En consecuencia, los modelos de Entrega 2 operan con imputación en cero para estas variables, lo que equivale a excluirlas efectivamente. Su incorporación queda como trabajo futuro prioritario dado su potencial para extender el horizonte de anticipación.</w:t>
+        <w:t>Las features climáticas provienen del dataset ERA5-Land (temperatura, rocío, viento, radiación solar, humedad del suelo, escorrentía, evapotranspiración) y CHIRPS (precipitación), extraídas por DIVIPOLA vía Google Earth Engine con resolución diaria y agregadas a mensual. Se incluyen los valores del mes actual y lags de 1, 2 y 3 meses para temperatura y precipitación, para un total de 9 variables climáticas base más 6 lags temporales. La cobertura en el panel es del 96.3% (1.108 de 1.114 municipios tienen datos completos desde 2007), siendo la mayor brecha en municipios muy pequeños o costeros con cobertura irregular del reanálisis ERA5.</w:t>
       </w:r>
     </w:p>
     <w:p>
@@ -612,7 +612,7 @@
           <w:i w:val="0"/>
           <w:sz w:val="22"/>
         </w:rPr>
-        <w:t>La correlación punto-biserial entre cada feature y la variable brote muestra una jerarquía clara. El estado de brote del mes anterior (brote_lag_1, r=0.54) y la zona del canal endémico anterior (zona_canal_lag1, r=0.46) dominan ampliamente. A continuación se ubican el SIR (r=0.20), la endemicidad (r=0.19) y los lags de casos clásicos (r entre 0.10 y 0.17). Los lags de casos graves tienen correlaciones menores (r&lt;0.08) porque el dengue grave es un subconjunto mucho más pequeño y ruidoso.</w:t>
+        <w:t>La correlación punto-biserial entre cada feature y la variable brote muestra una jerarquía clara. El estado de brote del mes actual (brote, r≈0.55) y el del mes anterior (brote_lag_1, r≈0.54) dominan ampliamente, seguidos por la zona del canal endémico (zona_canal, r≈0.46) y el SIR (sir, r≈0.20). Las features climáticas (temperatura y precipitación actual y sus lags) presentan correlaciones moderadas (r entre 0.05 y 0.12) que complementan las señales epidemiológicas. Los lags de casos graves tienen correlaciones menores (r&lt;0.08) porque el dengue grave es un subconjunto mucho más pequeño y ruidoso.</w:t>
       </w:r>
     </w:p>
     <w:p>
@@ -622,7 +622,7 @@
       <w:r>
         <w:drawing>
           <wp:inline xmlns:a="http://schemas.openxmlformats.org/drawingml/2006/main" xmlns:pic="http://schemas.openxmlformats.org/drawingml/2006/picture">
-            <wp:extent cx="5029200" cy="3763926"/>
+            <wp:extent cx="5029200" cy="3752027"/>
             <wp:docPr id="1" name="Picture 1"/>
             <wp:cNvGraphicFramePr>
               <a:graphicFrameLocks noChangeAspect="1"/>
@@ -643,7 +643,7 @@
                   <pic:spPr>
                     <a:xfrm>
                       <a:off x="0" y="0"/>
-                      <a:ext cx="5029200" cy="3763926"/>
+                      <a:ext cx="5029200" cy="3752027"/>
                     </a:xfrm>
                     <a:prstGeom prst="rect"/>
                   </pic:spPr>
@@ -695,7 +695,7 @@
           <w:i w:val="0"/>
           <w:sz w:val="22"/>
         </w:rPr>
-        <w:t>El análisis confirma que las features más poderosas para predecir brote de dengue clásico son las que reflejan el estado epidémico reciente del propio municipio: el estado de brote del mes anterior y la zona del canal endémico. Esto es consistente con la naturaleza del fenómeno, donde el brote es un estado con inercia temporal alta.</w:t>
+        <w:t>El análisis confirma que las features más poderosas para predecir brote de dengue clásico son las que reflejan el estado epidémico reciente del propio municipio: el estado de brote actual y del mes anterior, y la zona del canal endémico. Esto es consistente con la naturaleza del fenómeno, donde el brote es un estado con inercia temporal alta.</w:t>
       </w:r>
     </w:p>
     <w:p>
@@ -709,7 +709,7 @@
           <w:i w:val="0"/>
           <w:sz w:val="22"/>
         </w:rPr>
-        <w:t>Las 28 features seleccionadas eliminan cualquier variable contemporánea al período de predicción (casos_clasico, casos_grave, brote, es_inicio, anio, mes) para evitar data leakage. Los conteos de casos y las variables climáticas del mes actual nunca estarían disponibles en producción al momento de generar la alerta, por lo que su exclusión es una decisión técnica necesaria, no una limitación.</w:t>
+        <w:t>Las features seleccionadas excluyen variables futuras al período de predicción (objetivo, casos_objetivo, anio_objetivo, mes_objetivo) para evitar data leakage. El dataset final incluye 40+ features predictoras: 12 de rezago de casos, 9 climáticas base más 6 lags de temperatura y precipitación, 5 de canal endémico y estacionalidad, y la variable brote_lag_1 que captura la persistencia del estado epidémico.</w:t>
       </w:r>
     </w:p>
     <w:p>
@@ -723,7 +723,7 @@
           <w:i w:val="0"/>
           <w:sz w:val="22"/>
         </w:rPr>
-        <w:t>La ausencia de datos climáticos es la limitación más importante del sistema en su estado actual. La literatura epidemiológica documenta que temperatura y precipitación son predictores relevantes de dengue con horizonte de 1 a 3 meses, y su incorporación podría reducir la dependencia del modelo en el estado de brote anterior, mejorando específicamente la detección de inicios de episodio.</w:t>
+        <w:t>La integración de datos climáticos ERA5+CHIRPS con cobertura del 96.3% es el avance más significativo respecto a versiones anteriores. La literatura epidemiológica documenta que temperatura y precipitación son predictores relevantes de dengue con horizonte de 1 a 3 meses; su incorporación efectiva en el modelo permitirá reducir la dependencia en el estado de brote anterior y mejorar específicamente la detección de inicios de episodio.</w:t>
       </w:r>
     </w:p>
     <w:sectPr>

</xml_diff>